<commit_message>
Organize and update main.py with BACEN historical rate retrieval
</commit_message>
<xml_diff>
--- a/modelos/modelo_1.docx
+++ b/modelos/modelo_1.docx
@@ -10,19 +10,30 @@
         <w:t>AO JUÍZO DA ... VARA CÍVEL DA COMARCA DA CIDADE DE BELO HORIZONTE, ESTADO DE MINAS GERAIS</w:t>
       </w:r>
     </w:p>
-    <w:p>
-      <w:pPr>
-        <w:ind w:firstLine="0"/>
-      </w:pPr>
-      <w:r>
-        <w:t xml:space="preserve">BACEN: </w:t>
-      </w:r>
-      <w:r>
-        <w:t>{{{emprestimos_0_taxa_media}}}%</w:t>
-      </w:r>
-    </w:p>
-    <w:p/>
-    <w:p/>
+    <w:p/>
+    <w:p/>
+    <w:p>
+      <w:r>
+        <w:t>{{emprestimos_</w:t>
+      </w:r>
+      <w:r>
+        <w:t>0</w:t>
+      </w:r>
+      <w:r>
+        <w:t>_def_emprestimos}}</w:t>
+      </w:r>
+    </w:p>
+    <w:p>
+      <w:r>
+        <w:t>{{emprestimos_</w:t>
+      </w:r>
+      <w:r>
+        <w:t>0</w:t>
+      </w:r>
+      <w:r>
+        <w:t>_parcela_pessoal_atual}}</w:t>
+      </w:r>
+    </w:p>
     <w:p/>
     <w:p>
       <w:r>
@@ -158,7 +169,13 @@
       </w:pPr>
       <w:r>
         <w:lastRenderedPageBreak/>
-        <w:t>Declaração de Hipossuficiência (Doc. 6);</w:t>
+        <w:t xml:space="preserve">Declaração de </w:t>
+      </w:r>
+      <w:r>
+        <w:t>Hipossuficiência</w:t>
+      </w:r>
+      <w:r>
+        <w:t>;</w:t>
       </w:r>
     </w:p>
     <w:p>
@@ -171,7 +188,7 @@
         <w:ind w:left="3119"/>
       </w:pPr>
       <w:r>
-        <w:t>Extrato de pagamento do INSS (Doc. 2);</w:t>
+        <w:t>Declaração de Isenção de Imposto de Renda;</w:t>
       </w:r>
     </w:p>
     <w:p>
@@ -184,7 +201,13 @@
         <w:ind w:left="3119"/>
       </w:pPr>
       <w:r>
-        <w:t>Extratos bancários (Doc. 7);</w:t>
+        <w:t>Extra</w:t>
+      </w:r>
+      <w:r>
+        <w:t>to de pagamento do INSS</w:t>
+      </w:r>
+      <w:r>
+        <w:t>;</w:t>
       </w:r>
     </w:p>
     <w:p>
@@ -197,7 +220,29 @@
         <w:ind w:left="3119"/>
       </w:pPr>
       <w:r>
-        <w:t>Carteira de Trabalho digital (Doc. 8);</w:t>
+        <w:t>Extratos bancários</w:t>
+      </w:r>
+      <w:r>
+        <w:t>;</w:t>
+      </w:r>
+    </w:p>
+    <w:p>
+      <w:pPr>
+        <w:numPr>
+          <w:ilvl w:val="0"/>
+          <w:numId w:val="4"/>
+        </w:numPr>
+        <w:spacing w:after="0"/>
+        <w:ind w:left="3119"/>
+      </w:pPr>
+      <w:r>
+        <w:t>Carte</w:t>
+      </w:r>
+      <w:r>
+        <w:t>ira de Trabalho digital</w:t>
+      </w:r>
+      <w:r>
+        <w:t>;</w:t>
       </w:r>
     </w:p>
     <w:p>
@@ -209,7 +254,13 @@
         <w:ind w:left="3119"/>
       </w:pPr>
       <w:r>
-        <w:t>Folha resumo do Cadastro Único (Doc. 9).</w:t>
+        <w:t>Folha r</w:t>
+      </w:r>
+      <w:r>
+        <w:t>esumo do Cadastro Único</w:t>
+      </w:r>
+      <w:r>
+        <w:t>.</w:t>
       </w:r>
     </w:p>
     <w:p/>
@@ -250,30 +301,61 @@
     <w:p/>
     <w:p>
       <w:r>
-        <w:t xml:space="preserve">A parte requerente recebe Benefício de Prestação Continuada à Pessoa com Deficiência (BPC/LOAS) que corresponde ao valor de 1 (um) </w:t>
-      </w:r>
-      <w:r>
-        <w:t>salário-mínimo</w:t>
-      </w:r>
-      <w:r>
-        <w:t xml:space="preserve"> mensal, conforme comprovado em documentação anexa (Doc. 2).</w:t>
-      </w:r>
-    </w:p>
-    <w:p/>
-    <w:p>
-      <w:pPr>
-        <w:rPr>
-          <w:highlight w:val="yellow"/>
-        </w:rPr>
-      </w:pPr>
-      <w:r>
-        <w:t xml:space="preserve">Como já havia consignado toda sua margem para empréstimos consignados, por ser uma pessoa carente de recursos, em um momento de necessidade, contraiu mais 2 (dois) empréstimos pessoais com a instituição financeira requerida, o que a colocou em uma escancarada situação de superendividamento, uma vez que seus empréstimos (pessoais + consignados) comprometem o equivalente a </w:t>
-      </w:r>
-      <w:r>
-        <w:rPr>
-          <w:highlight w:val="yellow"/>
-        </w:rPr>
-        <w:t>{{comprometimento_renda}}</w:t>
+        <w:t xml:space="preserve">A parte requerente recebe Benefício de Prestação Continuada à Pessoa com Deficiência (BPC/LOAS) que corresponde ao valor de </w:t>
+      </w:r>
+      <w:r>
+        <w:t>R$</w:t>
+      </w:r>
+      <w:r>
+        <w:t>{{</w:t>
+      </w:r>
+      <w:proofErr w:type="spellStart"/>
+      <w:r>
+        <w:t>renda_mensal</w:t>
+      </w:r>
+      <w:proofErr w:type="spellEnd"/>
+      <w:r>
+        <w:t>}}</w:t>
+      </w:r>
+      <w:r>
+        <w:t>, conforme comprovado em documentação anexa.</w:t>
+      </w:r>
+    </w:p>
+    <w:p/>
+    <w:p>
+      <w:pPr>
+        <w:rPr>
+          <w:highlight w:val="yellow"/>
+        </w:rPr>
+      </w:pPr>
+      <w:r>
+        <w:t xml:space="preserve">Como já havia consignado toda sua margem para empréstimos consignados, por ser uma pessoa carente de recursos, em um momento de necessidade, contraiu mais </w:t>
+      </w:r>
+      <w:r>
+        <w:t>1 (um) empréstimo pessoal</w:t>
+      </w:r>
+      <w:r>
+        <w:t xml:space="preserve"> com a instituição financeira requerida, o que a colocou em uma escancarada situação de superendividamento, uma ve</w:t>
+      </w:r>
+      <w:r>
+        <w:t>z que seus empréstimos (pessoal</w:t>
+      </w:r>
+      <w:r>
+        <w:t xml:space="preserve"> + consignados) comprometem o equivalente a </w:t>
+      </w:r>
+      <w:r>
+        <w:t>R$</w:t>
+      </w:r>
+      <w:r>
+        <w:t>{{</w:t>
+      </w:r>
+      <w:proofErr w:type="spellStart"/>
+      <w:r>
+        <w:t>comprometimento_renda</w:t>
+      </w:r>
+      <w:proofErr w:type="spellEnd"/>
+      <w:r>
+        <w:t>}}</w:t>
       </w:r>
       <w:r>
         <w:t xml:space="preserve"> </w:t>
@@ -282,21 +364,20 @@
         <w:t xml:space="preserve">da sua remuneração mensal, tendo como líquido apenas </w:t>
       </w:r>
       <w:r>
-        <w:rPr>
-          <w:highlight w:val="yellow"/>
-        </w:rPr>
+        <w:t>R</w:t>
+      </w:r>
+      <w:r>
+        <w:t>$</w:t>
+      </w:r>
+      <w:r>
         <w:t>{{</w:t>
       </w:r>
-      <w:r>
-        <w:rPr>
-          <w:highlight w:val="yellow"/>
-        </w:rPr>
+      <w:proofErr w:type="spellStart"/>
+      <w:r>
         <w:t>valor_liquido</w:t>
       </w:r>
-      <w:r>
-        <w:rPr>
-          <w:highlight w:val="yellow"/>
-        </w:rPr>
+      <w:proofErr w:type="spellEnd"/>
+      <w:r>
         <w:t>}}</w:t>
       </w:r>
       <w:r>
@@ -309,11 +390,7 @@
     <w:p/>
     <w:p>
       <w:r>
-        <w:t xml:space="preserve">Além disso, os valores referentes aos empréstimos pessoais contratados, demonstram-se em flagrante abusividade em </w:t>
-      </w:r>
-      <w:r>
-        <w:lastRenderedPageBreak/>
-        <w:t>comparação aos valores praticados em contratos análogos, como ilustrado abaixo:</w:t>
+        <w:t>Além disso, os valores referentes aos empréstimos pessoais contratados, demonstram-se em flagrante abusividade em comparação aos valores praticados em contratos análogos, como ilustrado abaixo:</w:t>
       </w:r>
     </w:p>
     <w:p/>
@@ -332,7 +409,15 @@
           <w:sz w:val="24"/>
           <w:szCs w:val="24"/>
         </w:rPr>
-        <w:t>CONTRATO 1 (Doc. 3):</w:t>
+        <w:t>CONTRATO</w:t>
+      </w:r>
+      <w:r>
+        <w:rPr>
+          <w:b/>
+          <w:sz w:val="24"/>
+          <w:szCs w:val="24"/>
+        </w:rPr>
+        <w:t>:</w:t>
       </w:r>
     </w:p>
     <w:p>
@@ -341,12 +426,21 @@
           <w:ilvl w:val="1"/>
           <w:numId w:val="3"/>
         </w:numPr>
-      </w:pPr>
-      <w:r>
+        <w:rPr>
+          <w:highlight w:val="green"/>
+        </w:rPr>
+      </w:pPr>
+      <w:r>
+        <w:rPr>
+          <w:highlight w:val="green"/>
+        </w:rPr>
         <w:t xml:space="preserve">Data de contratação: </w:t>
       </w:r>
       <w:r>
-        <w:t>{{data_contratacao}}</w:t>
+        <w:rPr>
+          <w:highlight w:val="green"/>
+        </w:rPr>
+        <w:t>{{emprestimos_0_data}}</w:t>
       </w:r>
     </w:p>
     <w:p>
@@ -355,18 +449,39 @@
           <w:ilvl w:val="1"/>
           <w:numId w:val="3"/>
         </w:numPr>
-      </w:pPr>
-      <w:r>
+        <w:rPr>
+          <w:highlight w:val="green"/>
+        </w:rPr>
+      </w:pPr>
+      <w:r>
+        <w:rPr>
+          <w:highlight w:val="green"/>
+        </w:rPr>
         <w:t xml:space="preserve">Valor financiado: </w:t>
       </w:r>
       <w:r>
+        <w:rPr>
+          <w:highlight w:val="green"/>
+        </w:rPr>
         <w:t>R$</w:t>
       </w:r>
       <w:r>
-        <w:t xml:space="preserve"> </w:t>
-      </w:r>
-      <w:r>
-        <w:t>{{emprestimos_0_valor}}</w:t>
+        <w:rPr>
+          <w:highlight w:val="green"/>
+        </w:rPr>
+        <w:t>{{</w:t>
+      </w:r>
+      <w:r>
+        <w:rPr>
+          <w:highlight w:val="green"/>
+        </w:rPr>
+        <w:t>emprestimos_0_valor</w:t>
+      </w:r>
+      <w:r>
+        <w:rPr>
+          <w:highlight w:val="green"/>
+        </w:rPr>
+        <w:t>}}</w:t>
       </w:r>
     </w:p>
     <w:p>
@@ -375,12 +490,33 @@
           <w:ilvl w:val="1"/>
           <w:numId w:val="3"/>
         </w:numPr>
-      </w:pPr>
-      <w:r>
+        <w:rPr>
+          <w:highlight w:val="green"/>
+        </w:rPr>
+      </w:pPr>
+      <w:r>
+        <w:rPr>
+          <w:highlight w:val="green"/>
+        </w:rPr>
         <w:t xml:space="preserve">Número de parcelas: </w:t>
       </w:r>
       <w:r>
-        <w:t>{{emprestimos_0_parcelas}}</w:t>
+        <w:rPr>
+          <w:highlight w:val="green"/>
+        </w:rPr>
+        <w:t>{{</w:t>
+      </w:r>
+      <w:r>
+        <w:rPr>
+          <w:highlight w:val="green"/>
+        </w:rPr>
+        <w:t>emprestimos_0_parcelas</w:t>
+      </w:r>
+      <w:r>
+        <w:rPr>
+          <w:highlight w:val="green"/>
+        </w:rPr>
+        <w:t>}}</w:t>
       </w:r>
     </w:p>
     <w:p>
@@ -389,18 +525,39 @@
           <w:ilvl w:val="1"/>
           <w:numId w:val="3"/>
         </w:numPr>
-      </w:pPr>
-      <w:r>
+        <w:rPr>
+          <w:highlight w:val="green"/>
+        </w:rPr>
+      </w:pPr>
+      <w:r>
+        <w:rPr>
+          <w:highlight w:val="green"/>
+        </w:rPr>
         <w:t xml:space="preserve">Valor da parcela: </w:t>
       </w:r>
       <w:r>
+        <w:rPr>
+          <w:highlight w:val="green"/>
+        </w:rPr>
         <w:t>R$</w:t>
       </w:r>
       <w:r>
-        <w:t xml:space="preserve"> </w:t>
-      </w:r>
-      <w:r>
-        <w:t>{{emprestimos_0_parcela}}</w:t>
+        <w:rPr>
+          <w:highlight w:val="green"/>
+        </w:rPr>
+        <w:t>{{</w:t>
+      </w:r>
+      <w:r>
+        <w:rPr>
+          <w:highlight w:val="green"/>
+        </w:rPr>
+        <w:t>emprestimos_0_parcela</w:t>
+      </w:r>
+      <w:r>
+        <w:rPr>
+          <w:highlight w:val="green"/>
+        </w:rPr>
+        <w:t>}}</w:t>
       </w:r>
     </w:p>
     <w:p>
@@ -409,13 +566,36 @@
           <w:ilvl w:val="1"/>
           <w:numId w:val="3"/>
         </w:numPr>
-      </w:pPr>
-      <w:r>
+        <w:rPr>
+          <w:highlight w:val="green"/>
+        </w:rPr>
+      </w:pPr>
+      <w:r>
+        <w:rPr>
+          <w:highlight w:val="green"/>
+        </w:rPr>
         <w:t xml:space="preserve">Taxa de juros aplicada: </w:t>
       </w:r>
       <w:r>
-        <w:t>{{emprestimos_0_taxa}}%</w:t>
-      </w:r>
+        <w:rPr>
+          <w:highlight w:val="green"/>
+        </w:rPr>
+        <w:t>{{emprestimos_0_taxa</w:t>
+      </w:r>
+      <w:proofErr w:type="gramStart"/>
+      <w:r>
+        <w:rPr>
+          <w:highlight w:val="green"/>
+        </w:rPr>
+        <w:t>}}</w:t>
+      </w:r>
+      <w:r>
+        <w:rPr>
+          <w:highlight w:val="green"/>
+        </w:rPr>
+        <w:t>%</w:t>
+      </w:r>
+      <w:proofErr w:type="gramEnd"/>
     </w:p>
     <w:p>
       <w:pPr>
@@ -427,25 +607,39 @@
         <w:t xml:space="preserve">O contrato em apreciação apresenta taxa de juros mensal fixada em </w:t>
       </w:r>
       <w:r>
-        <w:t>{{taxa_juros_contrato}}</w:t>
-      </w:r>
-      <w:r>
-        <w:t>% a.m</w:t>
+        <w:t>{{</w:t>
+      </w:r>
+      <w:r>
+        <w:t>emprestimos_0_taxa</w:t>
+      </w:r>
+      <w:proofErr w:type="gramStart"/>
+      <w:r>
+        <w:t>}}</w:t>
+      </w:r>
+      <w:r>
+        <w:t>%</w:t>
+      </w:r>
+      <w:proofErr w:type="gramEnd"/>
+      <w:r>
+        <w:t>a.m</w:t>
       </w:r>
       <w:r>
         <w:t xml:space="preserve">., o que gerou à parte requerente uma dívida correspondente a </w:t>
       </w:r>
       <w:r>
-        <w:rPr>
-          <w:highlight w:val="yellow"/>
-        </w:rPr>
         <w:t>R$</w:t>
       </w:r>
       <w:r>
         <w:t>{{</w:t>
       </w:r>
       <w:r>
-        <w:t>total_emprestimo</w:t>
+        <w:t>emprestimos_</w:t>
+      </w:r>
+      <w:r>
+        <w:t>0</w:t>
+      </w:r>
+      <w:r>
+        <w:t>_total_emprestimo</w:t>
       </w:r>
       <w:r>
         <w:t>}}</w:t>
@@ -457,38 +651,42 @@
         <w:t xml:space="preserve"> </w:t>
       </w:r>
       <w:r>
+        <w:t>{{emprestimos_</w:t>
+      </w:r>
+      <w:r>
+        <w:t>0</w:t>
+      </w:r>
+      <w:r>
+        <w:t>_def_emprestimos}}</w:t>
+      </w:r>
+      <w:r>
+        <w:t xml:space="preserve">  vezes o valor financiado.</w:t>
+      </w:r>
+    </w:p>
+    <w:p/>
+    <w:p>
+      <w:r>
+        <w:t xml:space="preserve">Para mesma época, o Banco central divulgou que a média de mercado aplicada pelas instituições financeiras em contratos da mesma natureza fora de </w:t>
+      </w:r>
+      <w:r>
         <w:t>{{</w:t>
       </w:r>
       <w:r>
-        <w:t>acima_do_financiado</w:t>
-      </w:r>
-      <w:r>
-        <w:t>}}</w:t>
-      </w:r>
-      <w:r>
-        <w:t xml:space="preserve">  vezes o valor financiado.</w:t>
-      </w:r>
-    </w:p>
-    <w:p/>
-    <w:p>
-      <w:r>
-        <w:t xml:space="preserve">Para mesma época, o Banco central divulgou que a média de mercado aplicada pelas instituições financeiras em contratos da mesma natureza fora de </w:t>
-      </w:r>
-      <w:r>
-        <w:t>{{</w:t>
-      </w:r>
-      <w:r>
-        <w:t>taxa_media_bacen</w:t>
-      </w:r>
-      <w:r>
-        <w:t xml:space="preserve">}}% </w:t>
-      </w:r>
-      <w:r>
-        <w:rPr>
-          <w:highlight w:val="yellow"/>
-        </w:rPr>
+        <w:t>emprestimos_0_taxa_media</w:t>
+      </w:r>
+      <w:proofErr w:type="gramStart"/>
+      <w:r>
+        <w:t>}}%</w:t>
+      </w:r>
+      <w:proofErr w:type="gramEnd"/>
+      <w:r>
+        <w:t xml:space="preserve"> </w:t>
+      </w:r>
+      <w:proofErr w:type="spellStart"/>
+      <w:r>
         <w:t>a.m</w:t>
       </w:r>
+      <w:proofErr w:type="spellEnd"/>
       <w:r>
         <w:t>, como se observa:</w:t>
       </w:r>
@@ -541,16 +739,273 @@
       </w:r>
     </w:p>
     <w:p>
-      <w:pPr>
+      <w:r>
+        <w:t xml:space="preserve">Caso essa média tivesse sido aplicada, as parcelas do referido contrato teriam sido fixadas em </w:t>
+      </w:r>
+      <w:r>
+        <w:t>R</w:t>
+      </w:r>
+      <w:r>
+        <w:t>{{emprestimos_</w:t>
+      </w:r>
+      <w:r>
+        <w:t>0</w:t>
+      </w:r>
+      <w:r>
+        <w:t>_parcela_pessoal_atual}}</w:t>
+      </w:r>
+      <w:r>
+        <w:t xml:space="preserve">, </w:t>
+      </w:r>
+      <w:r>
+        <w:t>mudança significativa em comparação ao que foi praticado, como pode-se observar:</w:t>
+      </w:r>
+    </w:p>
+    <w:p/>
+    <w:tbl>
+      <w:tblPr>
+        <w:tblStyle w:val="Tabelacomgrade"/>
+        <w:tblW w:w="0" w:type="auto"/>
+        <w:tblLook w:val="04A0" w:firstRow="1" w:lastRow="0" w:firstColumn="1" w:lastColumn="0" w:noHBand="0" w:noVBand="1"/>
+      </w:tblPr>
+      <w:tblGrid>
+        <w:gridCol w:w="4247"/>
+        <w:gridCol w:w="4247"/>
+      </w:tblGrid>
+      <w:tr>
+        <w:trPr>
+          <w:trHeight w:val="853"/>
+        </w:trPr>
+        <w:tc>
+          <w:tcPr>
+            <w:tcW w:w="8494" w:type="dxa"/>
+            <w:gridSpan w:val="2"/>
+            <w:vAlign w:val="center"/>
+          </w:tcPr>
+          <w:p>
+            <w:pPr>
+              <w:ind w:firstLine="0"/>
+              <w:jc w:val="center"/>
+              <w:rPr>
+                <w:b/>
+              </w:rPr>
+            </w:pPr>
+            <w:r>
+              <w:rPr>
+                <w:b/>
+              </w:rPr>
+              <w:t>INFORMAÇÕES EMPRÉSTIMO COM A APLICAÇÃO DA TAXA MÉDIA BACEN</w:t>
+            </w:r>
+          </w:p>
+        </w:tc>
+      </w:tr>
+      <w:tr>
+        <w:trPr>
+          <w:trHeight w:val="567"/>
+        </w:trPr>
+        <w:tc>
+          <w:tcPr>
+            <w:tcW w:w="4247" w:type="dxa"/>
+            <w:vAlign w:val="center"/>
+          </w:tcPr>
+          <w:p>
+            <w:pPr>
+              <w:ind w:firstLine="0"/>
+              <w:jc w:val="left"/>
+            </w:pPr>
+            <w:r>
+              <w:t>Nº de parcelas</w:t>
+            </w:r>
+          </w:p>
+        </w:tc>
+        <w:tc>
+          <w:tcPr>
+            <w:tcW w:w="4247" w:type="dxa"/>
+            <w:vAlign w:val="center"/>
+          </w:tcPr>
+          <w:p>
+            <w:pPr>
+              <w:ind w:firstLine="0"/>
+              <w:jc w:val="left"/>
+            </w:pPr>
+            <w:r>
+              <w:t>{{emprestimos_0_parcelas}}</w:t>
+            </w:r>
+          </w:p>
+        </w:tc>
+      </w:tr>
+      <w:tr>
+        <w:trPr>
+          <w:trHeight w:val="567"/>
+        </w:trPr>
+        <w:tc>
+          <w:tcPr>
+            <w:tcW w:w="4247" w:type="dxa"/>
+            <w:vAlign w:val="center"/>
+          </w:tcPr>
+          <w:p>
+            <w:pPr>
+              <w:ind w:firstLine="0"/>
+              <w:jc w:val="left"/>
+            </w:pPr>
+            <w:r>
+              <w:t>Taxa de juros mensais (BACEN)</w:t>
+            </w:r>
+          </w:p>
+        </w:tc>
+        <w:tc>
+          <w:tcPr>
+            <w:tcW w:w="4247" w:type="dxa"/>
+            <w:vAlign w:val="center"/>
+          </w:tcPr>
+          <w:p>
+            <w:pPr>
+              <w:ind w:firstLine="0"/>
+              <w:jc w:val="left"/>
+            </w:pPr>
+            <w:r>
+              <w:t>{{emprestimos_0_taxa_media</w:t>
+            </w:r>
+            <w:proofErr w:type="gramStart"/>
+            <w:r>
+              <w:t>}}%</w:t>
+            </w:r>
+            <w:proofErr w:type="gramEnd"/>
+          </w:p>
+        </w:tc>
+      </w:tr>
+      <w:tr>
+        <w:trPr>
+          <w:trHeight w:val="567"/>
+        </w:trPr>
+        <w:tc>
+          <w:tcPr>
+            <w:tcW w:w="4247" w:type="dxa"/>
+            <w:vAlign w:val="center"/>
+          </w:tcPr>
+          <w:p>
+            <w:pPr>
+              <w:ind w:firstLine="0"/>
+              <w:jc w:val="left"/>
+            </w:pPr>
+            <w:r>
+              <w:t>Valor das parcelas</w:t>
+            </w:r>
+          </w:p>
+        </w:tc>
+        <w:tc>
+          <w:tcPr>
+            <w:tcW w:w="4247" w:type="dxa"/>
+            <w:vAlign w:val="center"/>
+          </w:tcPr>
+          <w:p>
+            <w:pPr>
+              <w:ind w:firstLine="0"/>
+              <w:jc w:val="left"/>
+            </w:pPr>
+            <w:r>
+              <w:t xml:space="preserve">R$ </w:t>
+            </w:r>
+            <w:r>
+              <w:t>{{emprestimos_0_parcela}}</w:t>
+            </w:r>
+          </w:p>
+        </w:tc>
+      </w:tr>
+      <w:tr>
+        <w:trPr>
+          <w:trHeight w:val="567"/>
+        </w:trPr>
+        <w:tc>
+          <w:tcPr>
+            <w:tcW w:w="4247" w:type="dxa"/>
+            <w:vAlign w:val="center"/>
+          </w:tcPr>
+          <w:p>
+            <w:pPr>
+              <w:ind w:firstLine="0"/>
+              <w:jc w:val="left"/>
+            </w:pPr>
+            <w:r>
+              <w:t>Valor financiado</w:t>
+            </w:r>
+          </w:p>
+        </w:tc>
+        <w:tc>
+          <w:tcPr>
+            <w:tcW w:w="4247" w:type="dxa"/>
+            <w:vAlign w:val="center"/>
+          </w:tcPr>
+          <w:p>
+            <w:pPr>
+              <w:ind w:firstLine="0"/>
+              <w:jc w:val="left"/>
+            </w:pPr>
+            <w:r>
+              <w:t>{{emprestimos_0_valor}}</w:t>
+            </w:r>
+          </w:p>
+        </w:tc>
+      </w:tr>
+      <w:tr>
+        <w:trPr>
+          <w:trHeight w:val="567"/>
+        </w:trPr>
+        <w:tc>
+          <w:tcPr>
+            <w:tcW w:w="4247" w:type="dxa"/>
+            <w:vAlign w:val="center"/>
+          </w:tcPr>
+          <w:p>
+            <w:pPr>
+              <w:ind w:firstLine="0"/>
+              <w:jc w:val="left"/>
+            </w:pPr>
+            <w:r>
+              <w:t>Valor total da dívida</w:t>
+            </w:r>
+          </w:p>
+        </w:tc>
+        <w:tc>
+          <w:tcPr>
+            <w:tcW w:w="4247" w:type="dxa"/>
+            <w:vAlign w:val="center"/>
+          </w:tcPr>
+          <w:p>
+            <w:pPr>
+              <w:ind w:firstLine="0"/>
+              <w:jc w:val="left"/>
+            </w:pPr>
+          </w:p>
+        </w:tc>
+      </w:tr>
+    </w:tbl>
+    <w:p>
+      <w:pPr>
+        <w:ind w:firstLine="0"/>
+      </w:pPr>
+    </w:p>
+    <w:p>
+      <w:pPr>
+        <w:ind w:firstLine="0"/>
+        <w:rPr>
+          <w:b/>
+          <w:sz w:val="28"/>
+          <w:szCs w:val="28"/>
+          <w:highlight w:val="yellow"/>
+        </w:rPr>
+      </w:pPr>
+      <w:r>
+        <w:t xml:space="preserve">Uma diferença de </w:t>
+      </w:r>
+      <w:r>
         <w:rPr>
           <w:bCs/>
           <w:sz w:val="28"/>
           <w:szCs w:val="28"/>
           <w:highlight w:val="yellow"/>
         </w:rPr>
-      </w:pPr>
-      <w:r>
-        <w:t xml:space="preserve">Caso essa média tivesse sido aplicada, as parcelas do referido contrato teriam sido fixadas em </w:t>
+        <w:t>{{</w:t>
       </w:r>
       <w:r>
         <w:rPr>
@@ -559,7 +1014,7 @@
           <w:szCs w:val="28"/>
           <w:highlight w:val="yellow"/>
         </w:rPr>
-        <w:t>{{</w:t>
+        <w:t>Valor total dívida original – Valor total dívida Bacen</w:t>
       </w:r>
       <w:r>
         <w:rPr>
@@ -568,7 +1023,16 @@
           <w:szCs w:val="28"/>
           <w:highlight w:val="yellow"/>
         </w:rPr>
-        <w:t>acima_do_financiado</w:t>
+        <w:t>}}</w:t>
+      </w:r>
+      <w:r>
+        <w:t xml:space="preserve">, valor correspondente a </w:t>
+      </w:r>
+      <w:r>
+        <w:rPr>
+          <w:highlight w:val="yellow"/>
+        </w:rPr>
+        <w:t>{{</w:t>
       </w:r>
       <w:r>
         <w:rPr>
@@ -577,98 +1041,15 @@
           <w:szCs w:val="28"/>
           <w:highlight w:val="yellow"/>
         </w:rPr>
-        <w:t>}}</w:t>
-      </w:r>
-      <w:r>
-        <w:t xml:space="preserve"> </w:t>
-      </w:r>
-      <w:r>
-        <w:rPr>
-          <w:highlight w:val="yellow"/>
-        </w:rPr>
-        <w:t>(valor da parcela considerando a taxa média de mercado)</w:t>
-      </w:r>
-      <w:r>
-        <w:t>, mudança significativa em comparação ao que foi praticado, como pode-se observar:</w:t>
-      </w:r>
-    </w:p>
-    <w:p/>
-    <w:p>
-      <w:pPr>
-        <w:ind w:firstLine="0"/>
-      </w:pPr>
-      <w:r>
-        <w:rPr>
-          <w:noProof/>
-        </w:rPr>
-        <w:drawing>
-          <wp:inline distT="0" distB="0" distL="0" distR="0" wp14:anchorId="6D39A1BF" wp14:editId="56FF0476">
-            <wp:extent cx="5400040" cy="2254250"/>
-            <wp:effectExtent l="0" t="0" r="0" b="0"/>
-            <wp:docPr id="1933442845" name="image5.png"/>
-            <wp:cNvGraphicFramePr/>
-            <a:graphic xmlns:a="http://schemas.openxmlformats.org/drawingml/2006/main">
-              <a:graphicData uri="http://schemas.openxmlformats.org/drawingml/2006/picture">
-                <pic:pic xmlns:pic="http://schemas.openxmlformats.org/drawingml/2006/picture">
-                  <pic:nvPicPr>
-                    <pic:cNvPr id="0" name="image5.png"/>
-                    <pic:cNvPicPr preferRelativeResize="0"/>
-                  </pic:nvPicPr>
-                  <pic:blipFill>
-                    <a:blip r:embed="rId9"/>
-                    <a:srcRect/>
-                    <a:stretch>
-                      <a:fillRect/>
-                    </a:stretch>
-                  </pic:blipFill>
-                  <pic:spPr>
-                    <a:xfrm>
-                      <a:off x="0" y="0"/>
-                      <a:ext cx="5400040" cy="2254250"/>
-                    </a:xfrm>
-                    <a:prstGeom prst="rect">
-                      <a:avLst/>
-                    </a:prstGeom>
-                    <a:ln/>
-                  </pic:spPr>
-                </pic:pic>
-              </a:graphicData>
-            </a:graphic>
-          </wp:inline>
-        </w:drawing>
-      </w:r>
-    </w:p>
-    <w:p/>
-    <w:p>
-      <w:pPr>
-        <w:ind w:firstLine="0"/>
-        <w:rPr>
-          <w:b/>
-          <w:sz w:val="28"/>
-          <w:szCs w:val="28"/>
-          <w:highlight w:val="yellow"/>
-        </w:rPr>
-      </w:pPr>
-      <w:r>
-        <w:t xml:space="preserve">Uma diferença de </w:t>
-      </w:r>
-      <w:r>
-        <w:rPr>
-          <w:bCs/>
-          <w:sz w:val="28"/>
-          <w:szCs w:val="28"/>
-          <w:highlight w:val="yellow"/>
-        </w:rPr>
-        <w:t>{{diferenca_contrato1}}</w:t>
-      </w:r>
-      <w:r>
-        <w:t>, valor correspondente a 2,23 vezes o que irá pagar ao fim do contrato.</w:t>
-      </w:r>
-    </w:p>
-    <w:p/>
-    <w:p/>
-    <w:p>
-      <w:r>
+        <w:t>Valor total dívida original / Valor total dívida Bacen}}</w:t>
+      </w:r>
+      <w:r>
+        <w:t xml:space="preserve"> vezes o que irá pagar ao fim do contrato.</w:t>
+      </w:r>
+    </w:p>
+    <w:p>
+      <w:r>
+        <w:lastRenderedPageBreak/>
         <w:t>Desta forma, fica flagrante a abusividade contida no contrato, cuja taxa de juros mensais extrapolam muito a média de mercado.</w:t>
       </w:r>
     </w:p>
@@ -694,7 +1075,7 @@
     <w:p/>
     <w:p>
       <w:r>
-        <w:t>Inicialmente, cumpre salientar que a parte requerente não mediu esforços na tentativa de evitar a via judicial para resolução do conflito, tendo inclusive realizado proposta de acordo extrajudicial pelo canal oficial do Consumidor.gov, como apresentado em documentação anexa (Doc. 5).</w:t>
+        <w:t>Inicialmente, cumpre salientar que a parte requerente não mediu esforços na tentativa de evitar a via judicial para resolução do conflito, tendo inclusive realizado proposta de acordo extrajudicial pelo canal oficial do Consumidor.gov, como apresentado em documentação anexa.</w:t>
       </w:r>
     </w:p>
     <w:p/>
@@ -863,7 +1244,7 @@
         </w:rPr>
         <w:t>, mediante análise das informações disponíveis em bancos de dados de proteção ao crédito, observado o disposto neste Código e na legislação sobre proteção de dados;      </w:t>
       </w:r>
-      <w:hyperlink r:id="rId10" w:anchor="art1">
+      <w:hyperlink r:id="rId9" w:anchor="art1">
         <w:r>
           <w:rPr>
             <w:i/>
@@ -891,7 +1272,105 @@
         <w:rPr>
           <w:u w:val="single"/>
         </w:rPr>
-        <w:t>No caso em análise, a taxa de juros cobrada pela instituição requerida alcança patamares muito superiores aos praticados no mercado financeiro. Conforme comprovado documentalmente, a taxa média de juros em 04/09/2024 foi de 5,55% a.m. e na data de 23/11/2024 de 5,67% a.m. ao mês, respectivamente, enquanto a taxa de juros mensal informada pela instituição requerida nos dois casos fora de 19,85% ao mês!</w:t>
+        <w:t xml:space="preserve">No caso em análise, a taxa de juros cobrada pela instituição requerida alcança patamares muito superiores aos praticados no mercado financeiro. Conforme comprovado documentalmente, a taxa média de juros em </w:t>
+      </w:r>
+      <w:r>
+        <w:rPr>
+          <w:u w:val="single"/>
+        </w:rPr>
+        <w:t>{{</w:t>
+      </w:r>
+      <w:proofErr w:type="spellStart"/>
+      <w:r>
+        <w:rPr>
+          <w:u w:val="single"/>
+        </w:rPr>
+        <w:t>data_contratacao</w:t>
+      </w:r>
+      <w:proofErr w:type="spellEnd"/>
+      <w:r>
+        <w:rPr>
+          <w:u w:val="single"/>
+        </w:rPr>
+        <w:t>}}</w:t>
+      </w:r>
+      <w:r>
+        <w:rPr>
+          <w:u w:val="single"/>
+        </w:rPr>
+        <w:t xml:space="preserve"> foi de </w:t>
+      </w:r>
+      <w:r>
+        <w:rPr>
+          <w:u w:val="single"/>
+        </w:rPr>
+        <w:t>{{</w:t>
+      </w:r>
+      <w:proofErr w:type="spellStart"/>
+      <w:r>
+        <w:rPr>
+          <w:u w:val="single"/>
+        </w:rPr>
+        <w:t>taxa_media_bacen</w:t>
+      </w:r>
+      <w:proofErr w:type="spellEnd"/>
+      <w:proofErr w:type="gramStart"/>
+      <w:r>
+        <w:rPr>
+          <w:u w:val="single"/>
+        </w:rPr>
+        <w:t>}}</w:t>
+      </w:r>
+      <w:r>
+        <w:rPr>
+          <w:u w:val="single"/>
+        </w:rPr>
+        <w:t>%</w:t>
+      </w:r>
+      <w:proofErr w:type="gramEnd"/>
+      <w:r>
+        <w:rPr>
+          <w:u w:val="single"/>
+        </w:rPr>
+        <w:t xml:space="preserve"> a.m., enquanto a taxa de juros mensal informada pela instituição req</w:t>
+      </w:r>
+      <w:r>
+        <w:rPr>
+          <w:u w:val="single"/>
+        </w:rPr>
+        <w:t xml:space="preserve">uerida </w:t>
+      </w:r>
+      <w:r>
+        <w:rPr>
+          <w:u w:val="single"/>
+        </w:rPr>
+        <w:t xml:space="preserve">fora de </w:t>
+      </w:r>
+      <w:r>
+        <w:rPr>
+          <w:u w:val="single"/>
+        </w:rPr>
+        <w:t>{{</w:t>
+      </w:r>
+      <w:proofErr w:type="spellStart"/>
+      <w:r>
+        <w:rPr>
+          <w:u w:val="single"/>
+        </w:rPr>
+        <w:t>taxa_original_pessoal</w:t>
+      </w:r>
+      <w:proofErr w:type="spellEnd"/>
+      <w:r>
+        <w:rPr>
+          <w:u w:val="single"/>
+        </w:rPr>
+        <w:t>}}</w:t>
+      </w:r>
+      <w:r>
+        <w:rPr>
+          <w:u w:val="single"/>
+        </w:rPr>
+        <w:t>% ao mês!</w:t>
       </w:r>
     </w:p>
     <w:p>
@@ -908,16 +1387,16 @@
         <mc:AlternateContent>
           <mc:Choice Requires="wps">
             <w:drawing>
-              <wp:anchor distT="0" distB="0" distL="114300" distR="114300" simplePos="0" relativeHeight="251658240" behindDoc="0" locked="0" layoutInCell="1" hidden="0" allowOverlap="1" wp14:anchorId="7C2B004A" wp14:editId="18B7143E">
+              <wp:anchor distT="0" distB="0" distL="114300" distR="114300" simplePos="0" relativeHeight="251658240" behindDoc="1" locked="0" layoutInCell="1" hidden="0" allowOverlap="1" wp14:anchorId="7C2B004A" wp14:editId="07F1CECE">
                 <wp:simplePos x="0" y="0"/>
                 <wp:positionH relativeFrom="column">
-                  <wp:posOffset>1562100</wp:posOffset>
+                  <wp:posOffset>1559698</wp:posOffset>
                 </wp:positionH>
                 <wp:positionV relativeFrom="paragraph">
-                  <wp:posOffset>279400</wp:posOffset>
+                  <wp:posOffset>278931</wp:posOffset>
                 </wp:positionV>
                 <wp:extent cx="3879850" cy="1403350"/>
-                <wp:effectExtent l="0" t="0" r="0" b="0"/>
+                <wp:effectExtent l="0" t="0" r="25400" b="25400"/>
                 <wp:wrapNone/>
                 <wp:docPr id="1933442842" name="Retângulo 1933442842"/>
                 <wp:cNvGraphicFramePr/>
@@ -927,8 +1406,8 @@
                       <wps:cNvSpPr/>
                       <wps:spPr>
                         <a:xfrm>
-                          <a:off x="3412425" y="3084675"/>
-                          <a:ext cx="3867150" cy="1390650"/>
+                          <a:off x="0" y="0"/>
+                          <a:ext cx="3879850" cy="1403350"/>
                         </a:xfrm>
                         <a:prstGeom prst="rect">
                           <a:avLst/>
@@ -967,7 +1446,7 @@
           </mc:Choice>
           <mc:Fallback>
             <w:pict>
-              <v:rect w14:anchorId="7C2B004A" id="Retângulo 1933442842" o:spid="_x0000_s1026" style="position:absolute;left:0;text-align:left;margin-left:123pt;margin-top:22pt;width:305.5pt;height:110.5pt;z-index:251658240;visibility:visible;mso-wrap-style:square;mso-wrap-distance-left:9pt;mso-wrap-distance-top:0;mso-wrap-distance-right:9pt;mso-wrap-distance-bottom:0;mso-position-horizontal:absolute;mso-position-horizontal-relative:text;mso-position-vertical:absolute;mso-position-vertical-relative:text;v-text-anchor:middle" o:gfxdata="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" filled="f" strokecolor="#1c3052" strokeweight="1pt">
+              <v:rect w14:anchorId="7C2B004A" id="Retângulo 1933442842" o:spid="_x0000_s1026" style="position:absolute;left:0;text-align:left;margin-left:122.8pt;margin-top:21.95pt;width:305.5pt;height:110.5pt;z-index:-251658240;visibility:visible;mso-wrap-style:square;mso-wrap-distance-left:9pt;mso-wrap-distance-top:0;mso-wrap-distance-right:9pt;mso-wrap-distance-bottom:0;mso-position-horizontal:absolute;mso-position-horizontal-relative:text;mso-position-vertical:absolute;mso-position-vertical-relative:text;v-text-anchor:middle" o:gfxdata="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" filled="f" strokecolor="#1c3052" strokeweight="1pt">
                 <v:stroke startarrowwidth="narrow" startarrowlength="short" endarrowwidth="narrow" endarrowlength="short"/>
                 <v:textbox inset="2.53958mm,2.53958mm,2.53958mm,2.53958mm">
                   <w:txbxContent>
@@ -1094,7 +1573,23 @@
           <w:highlight w:val="yellow"/>
           <w:u w:val="single"/>
         </w:rPr>
-        <w:t>Isso equivale a dizer que a taxa de juros aplicada aos contratos entabulados entre as partes é quase quatro vezes superior à taxa média mensal para as operações de mesma natureza no período.</w:t>
+        <w:t>Isso equivale a dizer que a taxa de juros aplicada ao</w:t>
+      </w:r>
+      <w:r>
+        <w:rPr>
+          <w:b/>
+          <w:highlight w:val="yellow"/>
+          <w:u w:val="single"/>
+        </w:rPr>
+        <w:t xml:space="preserve"> contrato entabulado</w:t>
+      </w:r>
+      <w:r>
+        <w:rPr>
+          <w:b/>
+          <w:highlight w:val="yellow"/>
+          <w:u w:val="single"/>
+        </w:rPr>
+        <w:t xml:space="preserve"> entre as partes é quase quatro vezes superior à taxa média mensal para as operações de mesma natureza no período.</w:t>
       </w:r>
     </w:p>
     <w:p>
@@ -1117,7 +1612,23 @@
       </w:r>
       <w:r>
         <w:lastRenderedPageBreak/>
-        <w:t>boa-fé objetiva, previsto no artigo 422 do Código Civil. Conforme leciona Pablo Stolze Gagliano e Rodolfo Pamplona Filho (Novo Curso de Direito Civil, Volume II), “a boa-fé objetiva exige que as partes não só tenham um comportamento ético, mas também que não exerçam seus direitos de forma excessivamente gravosa ao outro contratante”.</w:t>
+        <w:t xml:space="preserve">boa-fé objetiva, previsto no artigo 422 do Código Civil. Conforme leciona Pablo </w:t>
+      </w:r>
+      <w:proofErr w:type="spellStart"/>
+      <w:r>
+        <w:t>Stolze</w:t>
+      </w:r>
+      <w:proofErr w:type="spellEnd"/>
+      <w:r>
+        <w:t xml:space="preserve"> </w:t>
+      </w:r>
+      <w:proofErr w:type="spellStart"/>
+      <w:r>
+        <w:t>Gagliano</w:t>
+      </w:r>
+      <w:proofErr w:type="spellEnd"/>
+      <w:r>
+        <w:t xml:space="preserve"> e Rodolfo Pamplona Filho (Novo Curso de Direito Civil, Volume II), “a boa-fé objetiva exige que as partes não só tenham um comportamento ético, mas também que não exerçam seus direitos de forma excessivamente gravosa ao outro contratante”.</w:t>
       </w:r>
     </w:p>
     <w:p/>
@@ -1237,7 +1748,107 @@
           <w:sz w:val="22"/>
           <w:szCs w:val="22"/>
         </w:rPr>
-        <w:t xml:space="preserve">. 2. Na configuração da divergência do presente caso, temos, de um lado, o acórdão embargado da Terceira Turma concluindo que a norma do art. 42 do Código de Defesa do Consumidor pressupõe a demonstração de que a cobrança indevida decorreu de má-fé do credor fornecedor do serviço, enquanto os acórdãos-paradigmas da Primeira Seção afirmam que a repetição em dobro prescinde de má-fé, bastando a culpa. Ilustrando o posicionamento da Primeira Seção: EREsp 1.155.827/SP, Rel. Min. Humberto Martins, Primeira Seção, DJe 30/6/2011. Para exemplificar o posicionamento da Segunda Seção, vide: EREsp 1.127.721/RS, Rel. Min. Antônio Carlos Ferreira, Rel. p/ Acórdão Min. Marco Buzzi, Segunda Seção, DJe 13/3/2013. 3. Quanto ao citado parágrafo único do art. 42 do CDC, abstrai-se que a cobrança indevida será devolvida em dobro, "salvo hipótese de engano justificável". Em outras palavras, se não houver justificativa para a cobrança indevida, a repetição do indébito será em dobro. </w:t>
+        <w:t xml:space="preserve">. 2. Na configuração da divergência do presente caso, temos, de um lado, o acórdão embargado da Terceira Turma concluindo que a norma do art. 42 do Código de Defesa do Consumidor pressupõe a demonstração de que a cobrança indevida decorreu de má-fé do credor fornecedor do serviço, enquanto os acórdãos-paradigmas da Primeira Seção afirmam que a repetição em dobro prescinde de má-fé, bastando a culpa. Ilustrando o posicionamento da Primeira Seção: </w:t>
+      </w:r>
+      <w:proofErr w:type="spellStart"/>
+      <w:r>
+        <w:rPr>
+          <w:i/>
+          <w:color w:val="000000"/>
+          <w:sz w:val="22"/>
+          <w:szCs w:val="22"/>
+        </w:rPr>
+        <w:t>EREsp</w:t>
+      </w:r>
+      <w:proofErr w:type="spellEnd"/>
+      <w:r>
+        <w:rPr>
+          <w:i/>
+          <w:color w:val="000000"/>
+          <w:sz w:val="22"/>
+          <w:szCs w:val="22"/>
+        </w:rPr>
+        <w:t xml:space="preserve"> 1.155.827/SP, Rel. Min. Humberto Martins, Primeira Seção, </w:t>
+      </w:r>
+      <w:proofErr w:type="spellStart"/>
+      <w:r>
+        <w:rPr>
+          <w:i/>
+          <w:color w:val="000000"/>
+          <w:sz w:val="22"/>
+          <w:szCs w:val="22"/>
+        </w:rPr>
+        <w:t>DJe</w:t>
+      </w:r>
+      <w:proofErr w:type="spellEnd"/>
+      <w:r>
+        <w:rPr>
+          <w:i/>
+          <w:color w:val="000000"/>
+          <w:sz w:val="22"/>
+          <w:szCs w:val="22"/>
+        </w:rPr>
+        <w:t xml:space="preserve"> 30/6/2011. Para exemplificar o posicionamento da Segunda Seção, vide: </w:t>
+      </w:r>
+      <w:proofErr w:type="spellStart"/>
+      <w:r>
+        <w:rPr>
+          <w:i/>
+          <w:color w:val="000000"/>
+          <w:sz w:val="22"/>
+          <w:szCs w:val="22"/>
+        </w:rPr>
+        <w:t>EREsp</w:t>
+      </w:r>
+      <w:proofErr w:type="spellEnd"/>
+      <w:r>
+        <w:rPr>
+          <w:i/>
+          <w:color w:val="000000"/>
+          <w:sz w:val="22"/>
+          <w:szCs w:val="22"/>
+        </w:rPr>
+        <w:t xml:space="preserve"> 1.127.721/RS, Rel. Min. Antônio Carlos Ferreira, Rel. p/ Acórdão Min. Marco </w:t>
+      </w:r>
+      <w:proofErr w:type="spellStart"/>
+      <w:r>
+        <w:rPr>
+          <w:i/>
+          <w:color w:val="000000"/>
+          <w:sz w:val="22"/>
+          <w:szCs w:val="22"/>
+        </w:rPr>
+        <w:t>Buzzi</w:t>
+      </w:r>
+      <w:proofErr w:type="spellEnd"/>
+      <w:r>
+        <w:rPr>
+          <w:i/>
+          <w:color w:val="000000"/>
+          <w:sz w:val="22"/>
+          <w:szCs w:val="22"/>
+        </w:rPr>
+        <w:t xml:space="preserve">, Segunda Seção, </w:t>
+      </w:r>
+      <w:proofErr w:type="spellStart"/>
+      <w:r>
+        <w:rPr>
+          <w:i/>
+          <w:color w:val="000000"/>
+          <w:sz w:val="22"/>
+          <w:szCs w:val="22"/>
+        </w:rPr>
+        <w:t>DJe</w:t>
+      </w:r>
+      <w:proofErr w:type="spellEnd"/>
+      <w:r>
+        <w:rPr>
+          <w:i/>
+          <w:color w:val="000000"/>
+          <w:sz w:val="22"/>
+          <w:szCs w:val="22"/>
+        </w:rPr>
+        <w:t xml:space="preserve"> 13/3/2013. 3. Quanto ao citado parágrafo único do art. 42 do CDC, abstrai-se que a cobrança indevida será devolvida em dobro, "salvo hipótese de engano justificável". Em outras palavras, se não houver justificativa para a cobrança indevida, a repetição do indébito será em dobro. </w:t>
       </w:r>
       <w:r>
         <w:rPr>
@@ -1291,7 +1902,47 @@
           <w:color w:val="000000"/>
           <w:highlight w:val="yellow"/>
         </w:rPr>
-        <w:t>A tese da exclusividade do dolo inviabiliza, por exemplo, a devolução em dobro de pacotes de serviços, no caso de telefonia, jamais solicitados pelo consumidor e sobre o qual o fornecedor do serviço invoque qualquer "justificativa do seu engano". Isso porque o requisito subjetivo da má-fé é prova substancialmente difícil de produzir. Exigir que o consumidor prove dolo ou má-fé do fornecedor é imputar-lhe prova diabólica, padrão probatório que vai de encontro às próprias filosofia e ratio do CDC. 7. Não vislumbro distinção para os casos em que o indébito provém de contratos que não envolvam fornecimento de serviços públicos, de forma que também deve prevalecer para todas as hipóteses a tese, que defendi acima, de que tanto a conduta dolosa quanto culposa do fornecedor de serviços dá azo à devolução em dobro do indébito, de acordo com o art. 42 do CDC</w:t>
+        <w:t xml:space="preserve">A tese da exclusividade do dolo inviabiliza, por exemplo, a devolução em dobro de pacotes de serviços, no caso de telefonia, jamais solicitados pelo consumidor e sobre o qual o fornecedor do serviço invoque qualquer "justificativa do seu engano". Isso porque o requisito subjetivo da má-fé é prova substancialmente difícil de produzir. Exigir que o consumidor prove dolo ou má-fé do fornecedor é imputar-lhe prova diabólica, padrão probatório que vai de encontro às </w:t>
+      </w:r>
+      <w:proofErr w:type="gramStart"/>
+      <w:r>
+        <w:rPr>
+          <w:b/>
+          <w:i/>
+          <w:color w:val="000000"/>
+          <w:highlight w:val="yellow"/>
+        </w:rPr>
+        <w:t>próprias filosofia</w:t>
+      </w:r>
+      <w:proofErr w:type="gramEnd"/>
+      <w:r>
+        <w:rPr>
+          <w:b/>
+          <w:i/>
+          <w:color w:val="000000"/>
+          <w:highlight w:val="yellow"/>
+        </w:rPr>
+        <w:t xml:space="preserve"> e </w:t>
+      </w:r>
+      <w:proofErr w:type="spellStart"/>
+      <w:r>
+        <w:rPr>
+          <w:b/>
+          <w:i/>
+          <w:color w:val="000000"/>
+          <w:highlight w:val="yellow"/>
+        </w:rPr>
+        <w:t>ratio</w:t>
+      </w:r>
+      <w:proofErr w:type="spellEnd"/>
+      <w:r>
+        <w:rPr>
+          <w:b/>
+          <w:i/>
+          <w:color w:val="000000"/>
+          <w:highlight w:val="yellow"/>
+        </w:rPr>
+        <w:t xml:space="preserve"> do CDC. 7. Não vislumbro distinção para os casos em que o indébito provém de contratos que não envolvam fornecimento de serviços públicos, de forma que também deve prevalecer para todas as hipóteses a tese, que defendi acima, de que tanto a conduta dolosa quanto culposa do fornecedor de serviços dá azo à devolução em dobro do indébito, de acordo com o art. 42 do CDC</w:t>
       </w:r>
       <w:r>
         <w:rPr>
@@ -1300,7 +1951,47 @@
           <w:sz w:val="22"/>
           <w:szCs w:val="22"/>
         </w:rPr>
-        <w:t xml:space="preserve">. Nessas modalidades contratuais, também deve prevalecer o critério dúplice do dolo/culpa. Assim, tanto a conduta dolosa quanto a culposa do fornecedor de serviços dão substrato à devolução em dobro do indébito, à luz do art. 42 do CDC. 8. A Primeira Seção, no julgamento do REsp 1.113.403/RJ, de relatoria do Ministro Teori Albino Zavascki (DJe 15/9/2009), submetido ao regime dos recursos repetitivos do art. 543-C do Código de Processo Civil e da Resolução STJ 8/2008, firmou o entendimento de que, ante a ausência de disposição específica acerca do prazo prescricional aplicável à prática comercial indevida de cobrança excessiva, é de rigor a incidência das normas gerais relativas à prescrição insculpidas no Código Civil na ação de repetição de indébito de tarifas de água e esgoto. Assim, tem-se prazo vintenário, na forma estabelecida no art. 177 do Código Civil de 1916, ou decenal, de acordo com o previsto no art. 205 do Código Civil de 2002. Diante </w:t>
+        <w:t>. Nessas modalidades contratuais, também deve prevalecer o critério dúplice do dolo/culpa. Assim, tanto a conduta dolosa quanto a culposa do fornecedor de serviços dão substrato à devolução em dobro do indébito, à luz do art. 42 do CDC. 8. A Primeira Seção, no julgamento do REsp 1.113.403/RJ, de relatoria do Ministro Teori Albino Zavascki (</w:t>
+      </w:r>
+      <w:proofErr w:type="spellStart"/>
+      <w:r>
+        <w:rPr>
+          <w:i/>
+          <w:color w:val="000000"/>
+          <w:sz w:val="22"/>
+          <w:szCs w:val="22"/>
+        </w:rPr>
+        <w:t>DJe</w:t>
+      </w:r>
+      <w:proofErr w:type="spellEnd"/>
+      <w:r>
+        <w:rPr>
+          <w:i/>
+          <w:color w:val="000000"/>
+          <w:sz w:val="22"/>
+          <w:szCs w:val="22"/>
+        </w:rPr>
+        <w:t xml:space="preserve"> 15/9/2009), submetido ao regime dos recursos repetitivos do art. 543-C do Código de Processo Civil e da Resolução STJ 8/2008, firmou o entendimento de que, ante a ausência de disposição específica acerca do prazo prescricional aplicável à prática comercial indevida de cobrança excessiva, é de rigor a incidência das normas gerais relativas à prescrição insculpidas no Código Civil na ação de repetição de indébito de tarifas de água e esgoto. Assim, tem-se prazo </w:t>
+      </w:r>
+      <w:proofErr w:type="spellStart"/>
+      <w:r>
+        <w:rPr>
+          <w:i/>
+          <w:color w:val="000000"/>
+          <w:sz w:val="22"/>
+          <w:szCs w:val="22"/>
+        </w:rPr>
+        <w:t>vintenário</w:t>
+      </w:r>
+      <w:proofErr w:type="spellEnd"/>
+      <w:r>
+        <w:rPr>
+          <w:i/>
+          <w:color w:val="000000"/>
+          <w:sz w:val="22"/>
+          <w:szCs w:val="22"/>
+        </w:rPr>
+        <w:t xml:space="preserve">, na forma estabelecida no art. 177 do Código Civil de 1916, ou decenal, de acordo com o previsto no art. 205 do Código Civil de 2002. Diante </w:t>
       </w:r>
       <w:r>
         <w:rPr>
@@ -1368,7 +2059,29 @@
           <w:sz w:val="22"/>
           <w:szCs w:val="22"/>
         </w:rPr>
-        <w:t xml:space="preserve">Documento: 1498374 - Inteiro Teor do Acórdão - Site certificado - DJe: 30/03/2021 </w:t>
+        <w:t xml:space="preserve">Documento: 1498374 - Inteiro Teor do Acórdão - Site certificado - </w:t>
+      </w:r>
+      <w:proofErr w:type="spellStart"/>
+      <w:r>
+        <w:rPr>
+          <w:b/>
+          <w:i/>
+          <w:color w:val="000000"/>
+          <w:sz w:val="22"/>
+          <w:szCs w:val="22"/>
+        </w:rPr>
+        <w:t>DJe</w:t>
+      </w:r>
+      <w:proofErr w:type="spellEnd"/>
+      <w:r>
+        <w:rPr>
+          <w:b/>
+          <w:i/>
+          <w:color w:val="000000"/>
+          <w:sz w:val="22"/>
+          <w:szCs w:val="22"/>
+        </w:rPr>
+        <w:t xml:space="preserve">: 30/03/2021 </w:t>
       </w:r>
     </w:p>
     <w:p>
@@ -1433,7 +2146,35 @@
         <w:rPr>
           <w:highlight w:val="yellow"/>
         </w:rPr>
-        <w:t>Portanto, pleiteia, a parte autora, a devolução dos valores equivalentes a diferença dos valores que seriam pagos pela parte requerente, subtraídos pelo valor correspondente ao total que pagaria com a adequação das taxas de juros à média de mercado, multiplicado por dois, sendo devidos assim a restituição de R$ 18.727,2</w:t>
+        <w:t xml:space="preserve">Portanto, pleiteia, a parte autora, a devolução dos valores equivalentes a diferença dos valores que seriam pagos pela parte requerente, subtraídos pelo valor correspondente ao total que pagaria com a adequação das taxas de juros à média de mercado, multiplicado por dois, sendo devidos assim a restituição de R$ </w:t>
+      </w:r>
+      <w:proofErr w:type="gramStart"/>
+      <w:r>
+        <w:rPr>
+          <w:highlight w:val="yellow"/>
+        </w:rPr>
+        <w:t xml:space="preserve">{{ </w:t>
+      </w:r>
+      <w:proofErr w:type="spellStart"/>
+      <w:r>
+        <w:rPr>
+          <w:highlight w:val="yellow"/>
+        </w:rPr>
+        <w:t>devolução</w:t>
+      </w:r>
+      <w:proofErr w:type="gramEnd"/>
+      <w:r>
+        <w:rPr>
+          <w:highlight w:val="yellow"/>
+        </w:rPr>
+        <w:t>_dobro</w:t>
+      </w:r>
+      <w:proofErr w:type="spellEnd"/>
+      <w:r>
+        <w:rPr>
+          <w:highlight w:val="yellow"/>
+        </w:rPr>
+        <w:t>}}</w:t>
       </w:r>
       <w:r>
         <w:rPr>
@@ -1452,11 +2193,33 @@
         <w:rPr>
           <w:highlight w:val="yellow"/>
         </w:rPr>
-        <w:t>, para o contrato 1; e R$ 6.027,12, para o contrato 2.</w:t>
+        <w:t xml:space="preserve">, </w:t>
+      </w:r>
+      <w:r>
+        <w:rPr>
+          <w:highlight w:val="yellow"/>
+        </w:rPr>
+        <w:t>para o contrato de empréstimo</w:t>
+      </w:r>
+      <w:r>
+        <w:rPr>
+          <w:highlight w:val="yellow"/>
+        </w:rPr>
+        <w:t>.</w:t>
       </w:r>
       <w:r>
         <w:t xml:space="preserve"> </w:t>
       </w:r>
+    </w:p>
+    <w:p>
+      <w:pPr>
+        <w:ind w:firstLine="0"/>
+      </w:pPr>
+    </w:p>
+    <w:p>
+      <w:pPr>
+        <w:ind w:firstLine="0"/>
+      </w:pPr>
     </w:p>
     <w:p>
       <w:pPr>
@@ -1472,13 +2235,13 @@
         </w:numPr>
       </w:pPr>
       <w:r>
+        <w:lastRenderedPageBreak/>
         <w:t>DANO MORAL</w:t>
       </w:r>
     </w:p>
     <w:p/>
     <w:p>
       <w:r>
-        <w:lastRenderedPageBreak/>
         <w:t>Além da revisão e adequação das taxas de juros e da repetição em dobro do indébito, é necessário abordar os danos morais causados à parte requerente pela prática abusiva da instituição financeira requerida.</w:t>
       </w:r>
     </w:p>
@@ -1541,6 +2304,7 @@
         </w:rPr>
         <w:t>{</w:t>
       </w:r>
+      <w:proofErr w:type="spellStart"/>
       <w:r>
         <w:rPr>
           <w:b/>
@@ -1550,6 +2314,8 @@
         </w:rPr>
         <w:t>comprometimento_renda</w:t>
       </w:r>
+      <w:proofErr w:type="spellEnd"/>
+      <w:proofErr w:type="gramStart"/>
       <w:r>
         <w:rPr>
           <w:b/>
@@ -1575,27 +2341,28 @@
           <w:szCs w:val="28"/>
           <w:highlight w:val="yellow"/>
         </w:rPr>
-        <w:t xml:space="preserve"> de uma renda que já era de um salário mínimo.</w:t>
-      </w:r>
-    </w:p>
-    <w:p>
-      <w:pPr>
-        <w:rPr>
+        <w:t>%</w:t>
+      </w:r>
+      <w:proofErr w:type="gramEnd"/>
+      <w:r>
+        <w:rPr>
+          <w:b/>
           <w:sz w:val="28"/>
           <w:szCs w:val="28"/>
           <w:highlight w:val="yellow"/>
         </w:rPr>
-      </w:pPr>
-    </w:p>
-    <w:p>
-      <w:pPr>
+        <w:t xml:space="preserve"> de </w:t>
+      </w:r>
+      <w:r>
         <w:rPr>
           <w:b/>
           <w:sz w:val="28"/>
           <w:szCs w:val="28"/>
           <w:highlight w:val="yellow"/>
         </w:rPr>
-      </w:pPr>
+        <w:lastRenderedPageBreak/>
+        <w:t xml:space="preserve">uma renda </w:t>
+      </w:r>
       <w:r>
         <w:rPr>
           <w:b/>
@@ -1603,9 +2370,9 @@
           <w:szCs w:val="28"/>
           <w:highlight w:val="yellow"/>
         </w:rPr>
-        <w:lastRenderedPageBreak/>
-        <w:t xml:space="preserve">A parte requerente, em função da prática abusiva da requerida está sobrevivendo com apenas </w:t>
-      </w:r>
+        <w:t>de R${{</w:t>
+      </w:r>
+      <w:proofErr w:type="spellStart"/>
       <w:r>
         <w:rPr>
           <w:b/>
@@ -1613,8 +2380,9 @@
           <w:szCs w:val="28"/>
           <w:highlight w:val="yellow"/>
         </w:rPr>
-        <w:t>{{</w:t>
-      </w:r>
+        <w:t>renda_mensal</w:t>
+      </w:r>
+      <w:proofErr w:type="spellEnd"/>
       <w:r>
         <w:rPr>
           <w:b/>
@@ -1622,8 +2390,9 @@
           <w:szCs w:val="28"/>
           <w:highlight w:val="yellow"/>
         </w:rPr>
-        <w:t>valor_liquido</w:t>
-      </w:r>
+        <w:t xml:space="preserve"> – </w:t>
+      </w:r>
+      <w:proofErr w:type="spellStart"/>
       <w:r>
         <w:rPr>
           <w:b/>
@@ -1631,8 +2400,9 @@
           <w:szCs w:val="28"/>
           <w:highlight w:val="yellow"/>
         </w:rPr>
-        <w:t>}}</w:t>
-      </w:r>
+        <w:t>parcela_consignado</w:t>
+      </w:r>
+      <w:proofErr w:type="spellEnd"/>
       <w:r>
         <w:rPr>
           <w:b/>
@@ -1640,7 +2410,7 @@
           <w:szCs w:val="28"/>
           <w:highlight w:val="yellow"/>
         </w:rPr>
-        <w:t xml:space="preserve"> por mês, cerca de </w:t>
+        <w:t>}} já prejudicada por empréstimos consignados</w:t>
       </w:r>
       <w:r>
         <w:rPr>
@@ -1649,15 +2419,148 @@
           <w:szCs w:val="28"/>
           <w:highlight w:val="yellow"/>
         </w:rPr>
-        <w:t>{{Valor_diario}} por</w:t>
-      </w:r>
-      <w:r>
-        <w:rPr>
-          <w:b/>
+        <w:t>.</w:t>
+      </w:r>
+    </w:p>
+    <w:p>
+      <w:pPr>
+        <w:rPr>
           <w:sz w:val="28"/>
           <w:szCs w:val="28"/>
           <w:highlight w:val="yellow"/>
         </w:rPr>
+      </w:pPr>
+    </w:p>
+    <w:p>
+      <w:pPr>
+        <w:rPr>
+          <w:b/>
+          <w:sz w:val="28"/>
+          <w:szCs w:val="28"/>
+          <w:highlight w:val="yellow"/>
+        </w:rPr>
+      </w:pPr>
+      <w:r>
+        <w:rPr>
+          <w:b/>
+          <w:sz w:val="28"/>
+          <w:szCs w:val="28"/>
+          <w:highlight w:val="yellow"/>
+        </w:rPr>
+        <w:t xml:space="preserve">A parte requerente, em função da prática abusiva da requerida está sobrevivendo com apenas </w:t>
+      </w:r>
+      <w:r>
+        <w:rPr>
+          <w:b/>
+          <w:sz w:val="28"/>
+          <w:szCs w:val="28"/>
+          <w:highlight w:val="yellow"/>
+        </w:rPr>
+        <w:t>R$</w:t>
+      </w:r>
+      <w:r>
+        <w:rPr>
+          <w:b/>
+          <w:sz w:val="28"/>
+          <w:szCs w:val="28"/>
+          <w:highlight w:val="yellow"/>
+        </w:rPr>
+        <w:t>{{</w:t>
+      </w:r>
+      <w:proofErr w:type="spellStart"/>
+      <w:r>
+        <w:rPr>
+          <w:b/>
+          <w:sz w:val="28"/>
+          <w:szCs w:val="28"/>
+          <w:highlight w:val="yellow"/>
+        </w:rPr>
+        <w:t>valor_</w:t>
+      </w:r>
+      <w:proofErr w:type="gramStart"/>
+      <w:r>
+        <w:rPr>
+          <w:b/>
+          <w:sz w:val="28"/>
+          <w:szCs w:val="28"/>
+          <w:highlight w:val="yellow"/>
+        </w:rPr>
+        <w:t>liquido</w:t>
+      </w:r>
+      <w:proofErr w:type="spellEnd"/>
+      <w:proofErr w:type="gramEnd"/>
+      <w:r>
+        <w:rPr>
+          <w:b/>
+          <w:sz w:val="28"/>
+          <w:szCs w:val="28"/>
+          <w:highlight w:val="yellow"/>
+        </w:rPr>
+        <w:t>}}</w:t>
+      </w:r>
+      <w:r>
+        <w:rPr>
+          <w:b/>
+          <w:sz w:val="28"/>
+          <w:szCs w:val="28"/>
+          <w:highlight w:val="yellow"/>
+        </w:rPr>
+        <w:t xml:space="preserve"> por mês, cerca de </w:t>
+      </w:r>
+      <w:r>
+        <w:rPr>
+          <w:b/>
+          <w:sz w:val="28"/>
+          <w:szCs w:val="28"/>
+          <w:highlight w:val="yellow"/>
+        </w:rPr>
+        <w:t>R$</w:t>
+      </w:r>
+      <w:r>
+        <w:rPr>
+          <w:b/>
+          <w:sz w:val="28"/>
+          <w:szCs w:val="28"/>
+          <w:highlight w:val="yellow"/>
+        </w:rPr>
+        <w:t>{{</w:t>
+      </w:r>
+      <w:proofErr w:type="spellStart"/>
+      <w:r>
+        <w:rPr>
+          <w:b/>
+          <w:sz w:val="28"/>
+          <w:szCs w:val="28"/>
+          <w:highlight w:val="yellow"/>
+        </w:rPr>
+        <w:t>v</w:t>
+      </w:r>
+      <w:r>
+        <w:rPr>
+          <w:b/>
+          <w:sz w:val="28"/>
+          <w:szCs w:val="28"/>
+          <w:highlight w:val="yellow"/>
+        </w:rPr>
+        <w:t>alor_diario</w:t>
+      </w:r>
+      <w:proofErr w:type="spellEnd"/>
+      <w:r>
+        <w:rPr>
+          <w:b/>
+          <w:sz w:val="28"/>
+          <w:szCs w:val="28"/>
+          <w:highlight w:val="yellow"/>
+        </w:rPr>
+        <w:t>}} por</w:t>
+      </w:r>
+      <w:r>
+        <w:rPr>
+          <w:b/>
+          <w:sz w:val="28"/>
+          <w:szCs w:val="28"/>
+          <w:highlight w:val="yellow"/>
+        </w:rPr>
         <w:t xml:space="preserve"> dia!! É um escracho!!</w:t>
       </w:r>
     </w:p>
@@ -1682,11 +2585,7 @@
     <w:p/>
     <w:p>
       <w:r>
-        <w:t xml:space="preserve">Assim, requer-se a condenação da requerida ao pagamento de indenização por danos morais em valor não inferior a R$ </w:t>
-      </w:r>
-      <w:r>
-        <w:lastRenderedPageBreak/>
-        <w:t xml:space="preserve">R$10.000,00 (dez mil reais), considerando a gravidade da prática abusiva e os transtornos causados à parte requerente. </w:t>
+        <w:t xml:space="preserve">Assim, requer-se a condenação da requerida ao pagamento de indenização por danos morais em valor não inferior a R$ R$10.000,00 (dez mil reais), considerando a gravidade da prática abusiva e os transtornos causados à parte requerente. </w:t>
       </w:r>
     </w:p>
     <w:p/>
@@ -1711,7 +2610,15 @@
     <w:p/>
     <w:p>
       <w:r>
-        <w:t>O Código de Defesa do Consumidor (CDC) prevê, em seu artigo 6º, inciso VIII, a possibilidade de inversão do ônus da prova em favor do consumidor, quando, a critério do juiz, for verossímil a alegação ou quando o consumidor for hipossuficiente, segundo as regras ordinárias de experiências. Tal previsão visa equilibrar a relação entre consumidor e fornecedor, especialmente em situações onde o consumidor se encontra em desvantagem técnica, econômica ou jurídica.</w:t>
+        <w:t xml:space="preserve">O Código de Defesa do Consumidor (CDC) prevê, em seu artigo 6º, inciso VIII, a possibilidade de inversão do ônus da prova em favor do consumidor, quando, a critério do juiz, for verossímil a alegação ou quando o consumidor for hipossuficiente, segundo as regras ordinárias de experiências. Tal previsão visa equilibrar a relação entre consumidor e fornecedor, especialmente em situações </w:t>
+      </w:r>
+      <w:proofErr w:type="gramStart"/>
+      <w:r>
+        <w:t>onde</w:t>
+      </w:r>
+      <w:proofErr w:type="gramEnd"/>
+      <w:r>
+        <w:t xml:space="preserve"> o consumidor se encontra em desvantagem técnica, econômica ou jurídica.</w:t>
       </w:r>
     </w:p>
     <w:p>
@@ -1724,11 +2631,11 @@
     </w:p>
     <w:p>
       <w:r>
-        <w:t xml:space="preserve">No presente caso, a parte requerente, como consumidor, encontra-se em posição de hipossuficiência em relação à instituição financeira requerida. A complexidade dos contratos de empréstimo pessoal e a assimetria de informações entre as partes justificam a aplicação da inversão do </w:t>
+        <w:t xml:space="preserve">No presente caso, a parte requerente, como consumidor, encontra-se em posição de hipossuficiência em relação à instituição </w:t>
       </w:r>
       <w:r>
         <w:lastRenderedPageBreak/>
-        <w:t>ônus probatório, garantindo ao consumidor uma maior proteção e facilitando a comprovação dos fatos alegados.</w:t>
+        <w:t>financeira requerida. A complexidade dos contratos de empréstimo pessoal e a assimetria de informações entre as partes justificam a aplicação da inversão do ônus probatório, garantindo ao consumidor uma maior proteção e facilitando a comprovação dos fatos alegados.</w:t>
       </w:r>
     </w:p>
     <w:p/>
@@ -1743,6 +2650,9 @@
         <w:t>Tal medida é essencial para assegurar a efetiva proteção dos direitos do consumidor e promover a justiça na relação contratual, garantindo que a verdade dos fatos seja plenamente apurada e que o requerente não seja prejudicado pela desvantagem técnica e econômica em relação à instituição financeira requerida.</w:t>
       </w:r>
     </w:p>
+    <w:p/>
+    <w:p/>
+    <w:p/>
     <w:p/>
     <w:p>
       <w:pPr>
@@ -1753,6 +2663,7 @@
         </w:numPr>
       </w:pPr>
       <w:r>
+        <w:lastRenderedPageBreak/>
         <w:t>PEDIDOS</w:t>
       </w:r>
     </w:p>
@@ -1806,7 +2717,6 @@
         <w:rPr>
           <w:color w:val="000000"/>
         </w:rPr>
-        <w:lastRenderedPageBreak/>
         <w:t>Tramitação em juízo 100% digital;</w:t>
       </w:r>
     </w:p>
@@ -1906,11 +2816,28 @@
           <w:color w:val="000000"/>
           <w:highlight w:val="yellow"/>
         </w:rPr>
-        <w:t>R$ 18.727,20 (referente ao contrato)</w:t>
-      </w:r>
-      <w:r>
-        <w:rPr>
-          <w:color w:val="000000"/>
+        <w:t>R${{</w:t>
+      </w:r>
+      <w:proofErr w:type="spellStart"/>
+      <w:r>
+        <w:rPr>
+          <w:color w:val="000000"/>
+          <w:highlight w:val="yellow"/>
+        </w:rPr>
+        <w:t>devolução_dobro</w:t>
+      </w:r>
+      <w:proofErr w:type="spellEnd"/>
+      <w:r>
+        <w:rPr>
+          <w:color w:val="000000"/>
+          <w:highlight w:val="yellow"/>
+        </w:rPr>
+        <w:t>}}</w:t>
+      </w:r>
+      <w:r>
+        <w:rPr>
+          <w:color w:val="000000"/>
+          <w:highlight w:val="yellow"/>
         </w:rPr>
         <w:t xml:space="preserve"> </w:t>
       </w:r>
@@ -1995,13 +2922,21 @@
         <w:rPr>
           <w:highlight w:val="yellow"/>
         </w:rPr>
-        <w:t>R$ 34.754,32</w:t>
-      </w:r>
-      <w:r>
-        <w:rPr>
-          <w:highlight w:val="yellow"/>
-        </w:rPr>
-        <w:t xml:space="preserve"> (SOMA DOS VALORES A SEREM DEVOLVIDOS + 10.000 DE DANO MORAL)</w:t>
+        <w:t>R${{</w:t>
+      </w:r>
+      <w:proofErr w:type="spellStart"/>
+      <w:r>
+        <w:rPr>
+          <w:highlight w:val="yellow"/>
+        </w:rPr>
+        <w:t>valor_causa</w:t>
+      </w:r>
+      <w:proofErr w:type="spellEnd"/>
+      <w:r>
+        <w:rPr>
+          <w:highlight w:val="yellow"/>
+        </w:rPr>
+        <w:t>}}</w:t>
       </w:r>
     </w:p>
     <w:p/>
@@ -2014,6 +2949,7 @@
       <w:bookmarkStart w:id="1" w:name="_heading=h.gjdgxs" w:colFirst="0" w:colLast="0"/>
       <w:bookmarkEnd w:id="1"/>
       <w:r>
+        <w:lastRenderedPageBreak/>
         <w:t>Nestes termos,</w:t>
       </w:r>
     </w:p>
@@ -2038,7 +2974,15 @@
         <w:jc w:val="center"/>
       </w:pPr>
       <w:r>
-        <w:t>Batatais/SP, 18 de Novembro de 2024</w:t>
+        <w:t xml:space="preserve">Batatais/SP, 18 de </w:t>
+      </w:r>
+      <w:proofErr w:type="gramStart"/>
+      <w:r>
+        <w:t>Novembro</w:t>
+      </w:r>
+      <w:proofErr w:type="gramEnd"/>
+      <w:r>
+        <w:t xml:space="preserve"> de 2024</w:t>
       </w:r>
     </w:p>
     <w:p>
@@ -2098,7 +3042,21 @@
         <w:rPr>
           <w:b/>
         </w:rPr>
-        <w:t>Cícero Vogelaar Girardi</w:t>
+        <w:t xml:space="preserve">Cícero </w:t>
+      </w:r>
+      <w:proofErr w:type="spellStart"/>
+      <w:r>
+        <w:rPr>
+          <w:b/>
+        </w:rPr>
+        <w:t>Vogelaar</w:t>
+      </w:r>
+      <w:proofErr w:type="spellEnd"/>
+      <w:r>
+        <w:rPr>
+          <w:b/>
+        </w:rPr>
+        <w:t xml:space="preserve"> Girardi</w:t>
       </w:r>
     </w:p>
     <w:p>
@@ -2145,32 +3103,6 @@
         <w:ind w:firstLine="0"/>
         <w:jc w:val="center"/>
       </w:pPr>
-    </w:p>
-    <w:p>
-      <w:pPr>
-        <w:ind w:firstLine="0"/>
-        <w:jc w:val="center"/>
-      </w:pPr>
-    </w:p>
-    <w:p>
-      <w:pPr>
-        <w:ind w:firstLine="0"/>
-        <w:jc w:val="center"/>
-      </w:pPr>
-    </w:p>
-    <w:p>
-      <w:pPr>
-        <w:ind w:firstLine="0"/>
-        <w:jc w:val="center"/>
-      </w:pPr>
-    </w:p>
-    <w:p>
-      <w:pPr>
-        <w:ind w:firstLine="0"/>
-      </w:pPr>
-      <w:r>
-        <w:t>PREENCHER CONFOIRME INFORMAÇÕES DO CASO:</w:t>
-      </w:r>
     </w:p>
     <w:p>
       <w:pPr>
@@ -2922,19 +3854,19 @@
       </w:pPr>
     </w:lvl>
   </w:abstractNum>
-  <w:num w:numId="1" w16cid:durableId="1109005440">
+  <w:num w:numId="1" w16cid:durableId="1157569639">
     <w:abstractNumId w:val="4"/>
   </w:num>
-  <w:num w:numId="2" w16cid:durableId="1326587963">
+  <w:num w:numId="2" w16cid:durableId="710961537">
     <w:abstractNumId w:val="3"/>
   </w:num>
-  <w:num w:numId="3" w16cid:durableId="336810070">
+  <w:num w:numId="3" w16cid:durableId="465125499">
     <w:abstractNumId w:val="0"/>
   </w:num>
-  <w:num w:numId="4" w16cid:durableId="2026785267">
+  <w:num w:numId="4" w16cid:durableId="1934507809">
     <w:abstractNumId w:val="2"/>
   </w:num>
-  <w:num w:numId="5" w16cid:durableId="697002283">
+  <w:num w:numId="5" w16cid:durableId="2046833009">
     <w:abstractNumId w:val="1"/>
   </w:num>
 </w:numbering>
@@ -3451,6 +4383,7 @@
   <w:style w:type="character" w:default="1" w:styleId="Fontepargpadro">
     <w:name w:val="Default Paragraph Font"/>
     <w:uiPriority w:val="1"/>
+    <w:semiHidden/>
     <w:unhideWhenUsed/>
   </w:style>
   <w:style w:type="table" w:default="1" w:styleId="Tabelanormal">
@@ -3718,35 +4651,24 @@
       <w:szCs w:val="20"/>
     </w:rPr>
   </w:style>
-  <w:style w:type="paragraph" w:styleId="Pr-formataoHTML">
-    <w:name w:val="HTML Preformatted"/>
-    <w:basedOn w:val="Normal"/>
-    <w:link w:val="Pr-formataoHTMLChar"/>
-    <w:uiPriority w:val="99"/>
-    <w:semiHidden/>
-    <w:unhideWhenUsed/>
-    <w:rsid w:val="00C94B27"/>
+  <w:style w:type="table" w:styleId="Tabelacomgrade">
+    <w:name w:val="Table Grid"/>
+    <w:basedOn w:val="Tabelanormal"/>
+    <w:uiPriority w:val="39"/>
+    <w:rsid w:val="002A5EF3"/>
     <w:pPr>
       <w:spacing w:after="0" w:line="240" w:lineRule="auto"/>
     </w:pPr>
-    <w:rPr>
-      <w:rFonts w:ascii="Consolas" w:hAnsi="Consolas"/>
-      <w:sz w:val="20"/>
-      <w:szCs w:val="20"/>
-    </w:rPr>
-  </w:style>
-  <w:style w:type="character" w:customStyle="1" w:styleId="Pr-formataoHTMLChar">
-    <w:name w:val="Pré-formatação HTML Char"/>
-    <w:basedOn w:val="Fontepargpadro"/>
-    <w:link w:val="Pr-formataoHTML"/>
-    <w:uiPriority w:val="99"/>
-    <w:semiHidden/>
-    <w:rsid w:val="00C94B27"/>
-    <w:rPr>
-      <w:rFonts w:ascii="Consolas" w:hAnsi="Consolas"/>
-      <w:sz w:val="20"/>
-      <w:szCs w:val="20"/>
-    </w:rPr>
+    <w:tblPr>
+      <w:tblBorders>
+        <w:top w:val="single" w:sz="4" w:space="0" w:color="auto"/>
+        <w:left w:val="single" w:sz="4" w:space="0" w:color="auto"/>
+        <w:bottom w:val="single" w:sz="4" w:space="0" w:color="auto"/>
+        <w:right w:val="single" w:sz="4" w:space="0" w:color="auto"/>
+        <w:insideH w:val="single" w:sz="4" w:space="0" w:color="auto"/>
+        <w:insideV w:val="single" w:sz="4" w:space="0" w:color="auto"/>
+      </w:tblBorders>
+    </w:tblPr>
   </w:style>
 </w:styles>
 </file>

</xml_diff>

<commit_message>
Revise modelo_1.docx to update legal language and improve clarity in contract revision action
</commit_message>
<xml_diff>
--- a/modelos/modelo_1.docx
+++ b/modelos/modelo_1.docx
@@ -28,13 +28,45 @@
           <w:color w:val="FF0000"/>
         </w:rPr>
       </w:pPr>
+      <w:proofErr w:type="gramStart"/>
       <w:r>
         <w:rPr>
           <w:b/>
           <w:color w:val="FF0000"/>
         </w:rPr>
-        <w:t>{                                                                     INSIRIR                                                                              }</w:t>
-      </w:r>
+        <w:t xml:space="preserve">{  </w:t>
+      </w:r>
+      <w:proofErr w:type="gramEnd"/>
+      <w:r>
+        <w:rPr>
+          <w:b/>
+          <w:color w:val="FF0000"/>
+        </w:rPr>
+        <w:t xml:space="preserve">                                                                   </w:t>
+      </w:r>
+      <w:r>
+        <w:rPr>
+          <w:b/>
+          <w:color w:val="FF0000"/>
+        </w:rPr>
+        <w:t>vem, a presença deste douto juízo, por meio de seus procuradores, apresentar:</w:t>
+      </w:r>
+      <w:r>
+        <w:rPr>
+          <w:b/>
+          <w:color w:val="FF0000"/>
+        </w:rPr>
+        <w:t xml:space="preserve">                                                                 </w:t>
+      </w:r>
+      <w:proofErr w:type="gramStart"/>
+      <w:r>
+        <w:rPr>
+          <w:b/>
+          <w:color w:val="FF0000"/>
+        </w:rPr>
+        <w:t xml:space="preserve">  }</w:t>
+      </w:r>
+      <w:proofErr w:type="gramEnd"/>
     </w:p>
     <w:p>
       <w:pPr>
@@ -109,7 +141,19 @@
         <w:t>}</w:t>
       </w:r>
       <w:r>
-        <w:t>, com sede no endereço RUARIO DE JANEIRO, 654 -, Bairro CENTRO, CEP 30160912, BELO HORIZONTE - MG, pelos fatos e fundamentos a seguir expostos:</w:t>
+        <w:t xml:space="preserve">, com sede no endereço </w:t>
+      </w:r>
+      <w:r>
+        <w:t xml:space="preserve">AV do Contorno, Nº 5800, andar 11, 12, 13, 14 e 15 – SAVASSI, </w:t>
+      </w:r>
+      <w:r>
+        <w:t>BELO HORIZONTE - MG,</w:t>
+      </w:r>
+      <w:r>
+        <w:t xml:space="preserve"> CEP 30.110-042,</w:t>
+      </w:r>
+      <w:r>
+        <w:t xml:space="preserve"> pelos fatos e fundamentos a seguir expostos:</w:t>
       </w:r>
     </w:p>
     <w:p/>
@@ -124,11 +168,14 @@
     <w:p/>
     <w:p>
       <w:r>
-        <w:t xml:space="preserve">Inicialmente, esclarece a parte autora, que decidiu por ingressar com a presente demanda no foro de sede do réu, ainda que de sua liberalidade optar por seu foro de domicílio, uma vez que seus procuradores possuem inscrições apenas nos estados de São Paulo e Minas </w:t>
+        <w:t xml:space="preserve">Inicialmente, esclarece a parte autora, que decidiu por ingressar com a presente demanda no foro de sede do réu, ainda que de sua liberalidade optar por seu foro de domicílio, uma vez que seus </w:t>
       </w:r>
       <w:r>
         <w:lastRenderedPageBreak/>
-        <w:t>Gerais e que optou pela contratação destes ainda que ciente deste fato, como comprova em declaração anexa (Doc. 1).</w:t>
+        <w:t>procuradores possuem inscrições apenas nos estados de São Paulo e Minas Gerais e que optou pela contratação destes ainda que ciente deste fato, como comprova em declaração anexa</w:t>
+      </w:r>
+      <w:r>
+        <w:t>.</w:t>
       </w:r>
     </w:p>
     <w:p/>
@@ -156,11 +203,8 @@
     <w:p/>
     <w:p>
       <w:r>
-        <w:t xml:space="preserve">Portanto, requer-se o recebimento da presente ação e o seu regular processamento, sem qualquer declinação de </w:t>
-      </w:r>
-      <w:r>
         <w:lastRenderedPageBreak/>
-        <w:t>competência, por estar de acordo com as disposições legais e com a jurisprudência pacífica dos tribunais.</w:t>
+        <w:t>Portanto, requer-se o recebimento da presente ação e o seu regular processamento, sem qualquer declinação de competência, por estar de acordo com as disposições legais e com a jurisprudência pacífica dos tribunais.</w:t>
       </w:r>
     </w:p>
     <w:p/>
@@ -286,6 +330,7 @@
         <w:ind w:left="3119"/>
       </w:pPr>
       <w:r>
+        <w:lastRenderedPageBreak/>
         <w:t>Folha r</w:t>
       </w:r>
       <w:r>
@@ -298,7 +343,6 @@
     <w:p/>
     <w:p>
       <w:r>
-        <w:lastRenderedPageBreak/>
         <w:t>Portanto, em razão da sua condição financeira e com base na legislação vigente, requer-se a este juízo a concessão da gratuidade da justiça à parte requerente, a fim de garantir o pleno acesso ao Judiciário e a possibilidade de buscar a proteção de seus direitos sem que isso implique em sacrifício econômico insuportável.</w:t>
       </w:r>
     </w:p>
@@ -354,7 +398,6 @@
     <w:p/>
     <w:p>
       <w:pPr>
-        <w:ind w:firstLine="0"/>
         <w:rPr>
           <w:sz w:val="28"/>
           <w:szCs w:val="28"/>
@@ -374,6 +417,9 @@
       </w:r>
       <w:r>
         <w:t xml:space="preserve"> + consignados) comprometem o equivalente a </w:t>
+      </w:r>
+      <w:r>
+        <w:t xml:space="preserve">R$ </w:t>
       </w:r>
       <w:r>
         <w:rPr>
@@ -525,6 +571,7 @@
         <w:rPr>
           <w:highlight w:val="green"/>
         </w:rPr>
+        <w:lastRenderedPageBreak/>
         <w:t xml:space="preserve">Número de parcelas: </w:t>
       </w:r>
       <w:r>
@@ -560,7 +607,6 @@
         <w:rPr>
           <w:highlight w:val="green"/>
         </w:rPr>
-        <w:lastRenderedPageBreak/>
         <w:t xml:space="preserve">Valor da parcela: </w:t>
       </w:r>
       <w:r>
@@ -602,14 +648,22 @@
         <w:rPr>
           <w:highlight w:val="green"/>
         </w:rPr>
-        <w:t>{{emprestimos_0_taxa}}</w:t>
-      </w:r>
+        <w:t>{{emprestimos_0_taxa</w:t>
+      </w:r>
+      <w:proofErr w:type="gramStart"/>
       <w:r>
         <w:rPr>
           <w:highlight w:val="green"/>
         </w:rPr>
+        <w:t>}}</w:t>
+      </w:r>
+      <w:r>
+        <w:rPr>
+          <w:highlight w:val="green"/>
+        </w:rPr>
         <w:t>%</w:t>
       </w:r>
+      <w:proofErr w:type="gramEnd"/>
     </w:p>
     <w:p>
       <w:pPr>
@@ -626,12 +680,14 @@
       <w:r>
         <w:t>emprestimos_0_taxa</w:t>
       </w:r>
+      <w:proofErr w:type="gramStart"/>
       <w:r>
         <w:t>}}</w:t>
       </w:r>
       <w:r>
         <w:t>%</w:t>
       </w:r>
+      <w:proofErr w:type="gramEnd"/>
       <w:r>
         <w:t>a.m</w:t>
       </w:r>
@@ -666,10 +722,18 @@
         <w:t>0</w:t>
       </w:r>
       <w:r>
-        <w:t>_def_emprestimos}}</w:t>
-      </w:r>
-      <w:r>
-        <w:t xml:space="preserve">  vezes o valor financiado.</w:t>
+        <w:t>_def_emprestimos</w:t>
+      </w:r>
+      <w:proofErr w:type="gramStart"/>
+      <w:r>
+        <w:t>}}</w:t>
+      </w:r>
+      <w:r>
+        <w:t xml:space="preserve">  vezes</w:t>
+      </w:r>
+      <w:proofErr w:type="gramEnd"/>
+      <w:r>
+        <w:t xml:space="preserve"> o valor financiado.</w:t>
       </w:r>
     </w:p>
     <w:p/>
@@ -705,42 +769,22 @@
         <w:t>series temporais de código 25464</w:t>
       </w:r>
       <w:r>
-        <w:t>, a qual pode ser</w:t>
-      </w:r>
-      <w:r>
-        <w:t xml:space="preserve"> </w:t>
-      </w:r>
-      <w:r>
-        <w:t xml:space="preserve">constatada no sítio: </w:t>
+        <w:t xml:space="preserve">, a qual pode ser constatada no sítio: </w:t>
       </w:r>
       <w:hyperlink r:id="rId8" w:history="1">
         <w:r>
           <w:rPr>
             <w:rStyle w:val="Hyperlink"/>
           </w:rPr>
-          <w:t>https://www3.bcb.gov.br/sgspub/locali</w:t>
-        </w:r>
-        <w:r>
-          <w:rPr>
-            <w:rStyle w:val="Hyperlink"/>
-          </w:rPr>
-          <w:t>z</w:t>
-        </w:r>
-        <w:r>
-          <w:rPr>
-            <w:rStyle w:val="Hyperlink"/>
-          </w:rPr>
-          <w:t>arseries/localizarSeries.do?method=prepararTelaLocalizarSeries</w:t>
+          <w:t>https://www3.bcb.gov.br/sgspub/localizarseries/localizarSeries.do?method=prepararTelaLocalizarSeries</w:t>
         </w:r>
       </w:hyperlink>
       <w:r>
         <w:t>.</w:t>
       </w:r>
     </w:p>
-    <w:p>
-      <w:pPr>
-        <w:ind w:firstLine="0"/>
-      </w:pPr>
+    <w:p/>
+    <w:p>
       <w:r>
         <w:t xml:space="preserve">Caso essa média tivesse sido aplicada, as parcelas do referido contrato teriam sido fixadas em </w:t>
       </w:r>
@@ -794,7 +838,6 @@
               <w:rPr>
                 <w:b/>
               </w:rPr>
-              <w:lastRenderedPageBreak/>
               <w:t>INFORMAÇÕES EMPRÉSTIMO COM A APLICAÇÃO DA TAXA MÉDIA BACEN</w:t>
             </w:r>
           </w:p>
@@ -865,8 +908,13 @@
               <w:jc w:val="left"/>
             </w:pPr>
             <w:r>
-              <w:t>{{emprestimos_0_taxa_media}}%</w:t>
+              <w:t>{{emprestimos_0_taxa_</w:t>
             </w:r>
+            <w:proofErr w:type="gramStart"/>
+            <w:r>
+              <w:t>media}}%</w:t>
+            </w:r>
+            <w:proofErr w:type="gramEnd"/>
           </w:p>
         </w:tc>
       </w:tr>
@@ -1003,9 +1051,6 @@
       </w:pPr>
     </w:p>
     <w:p>
-      <w:pPr>
-        <w:ind w:firstLine="0"/>
-      </w:pPr>
       <w:r>
         <w:t xml:space="preserve">Uma diferença de </w:t>
       </w:r>
@@ -1032,6 +1077,7 @@
         <w:t>.</w:t>
       </w:r>
     </w:p>
+    <w:p/>
     <w:p>
       <w:r>
         <w:t>Desta forma, fica flagrante a abusividade contida no contrato, cuja taxa de juros mensais extrapolam muito a média de mercado.</w:t>
@@ -1059,7 +1105,6 @@
     <w:p/>
     <w:p>
       <w:r>
-        <w:lastRenderedPageBreak/>
         <w:t>Inicialmente, cumpre salientar que a parte requerente não mediu esforços na tentativa de evitar a via judicial para resolução do conflito, tendo inclusive realizado proposta de acordo extrajudicial pelo canal oficial do Consumidor.gov, como apresentado em documentação anexa.</w:t>
       </w:r>
     </w:p>
@@ -1101,11 +1146,8 @@
     </w:p>
     <w:p>
       <w:r>
-        <w:t xml:space="preserve">No presente caso, as taxas de juros aplicadas aos contratos da parte requerente são claramente excessivas quando comparadas à taxa média de mercado divulgada pelo Banco Central para a </w:t>
-      </w:r>
-      <w:r>
         <w:lastRenderedPageBreak/>
-        <w:t>mesma data e natureza de operação. Esta discrepância evidencia a abusividade da taxa imposta pela instituição financeira requerida.</w:t>
+        <w:t>No presente caso, as taxas de juros aplicadas aos contratos da parte requerente são claramente excessivas quando comparadas à taxa média de mercado divulgada pelo Banco Central para a mesma data e natureza de operação. Esta discrepância evidencia a abusividade da taxa imposta pela instituição financeira requerida.</w:t>
       </w:r>
     </w:p>
     <w:p/>
@@ -1262,6 +1304,7 @@
         <w:t xml:space="preserve">No caso em análise, a taxa de juros cobrada pela instituição requerida alcança patamares muito superiores aos praticados no mercado </w:t>
       </w:r>
       <w:r>
+        <w:lastRenderedPageBreak/>
         <w:t xml:space="preserve">financeiro. Conforme comprovado documentalmente, a taxa média de juros em </w:t>
       </w:r>
       <w:r>
@@ -1276,6 +1319,7 @@
         </w:rPr>
         <w:t>emprestimos_0_data</w:t>
       </w:r>
+      <w:proofErr w:type="gramStart"/>
       <w:r>
         <w:rPr>
           <w:color w:val="000000" w:themeColor="text1"/>
@@ -1295,302 +1339,102 @@
         <w:t xml:space="preserve"> </w:t>
       </w:r>
       <w:r>
-        <w:t xml:space="preserve">foi de </w:t>
+        <w:t>foi</w:t>
+      </w:r>
+      <w:proofErr w:type="gramEnd"/>
+      <w:r>
+        <w:t xml:space="preserve"> de </w:t>
       </w:r>
       <w:r>
         <w:t>{{</w:t>
       </w:r>
       <w:r>
-        <w:t>emprestimos_0_taxa_media</w:t>
+        <w:t>emprestimos_0_taxa_</w:t>
+      </w:r>
+      <w:proofErr w:type="gramStart"/>
+      <w:r>
+        <w:t>media</w:t>
       </w:r>
       <w:r>
         <w:t>}}</w:t>
       </w:r>
       <w:r>
-        <w:t xml:space="preserve">% a.m., enquanto </w:t>
+        <w:t>%</w:t>
+      </w:r>
+      <w:proofErr w:type="gramEnd"/>
+      <w:r>
+        <w:t xml:space="preserve"> a.m., enquanto a taxa de juros mensal informada pela instituição req</w:t>
+      </w:r>
+      <w:r>
+        <w:t xml:space="preserve">uerida </w:t>
+      </w:r>
+      <w:r>
+        <w:t xml:space="preserve">fora de </w:t>
+      </w:r>
+      <w:r>
+        <w:t>{{emprestimos_0_taxa</w:t>
+      </w:r>
+      <w:proofErr w:type="gramStart"/>
+      <w:r>
+        <w:t>}}%</w:t>
+      </w:r>
+      <w:proofErr w:type="gramEnd"/>
+      <w:r>
+        <w:t xml:space="preserve"> </w:t>
+      </w:r>
+      <w:r>
+        <w:t>ao mês!</w:t>
+      </w:r>
+    </w:p>
+    <w:p>
+      <w:pPr>
+        <w:ind w:firstLine="2268"/>
+        <w:rPr>
+          <w:u w:val="single"/>
+        </w:rPr>
+      </w:pPr>
+    </w:p>
+    <w:p>
+      <w:pPr>
+        <w:ind w:firstLine="2268"/>
+        <w:rPr>
+          <w:u w:val="single"/>
+        </w:rPr>
+      </w:pPr>
+      <w:r>
+        <w:t xml:space="preserve">Tal discrepância de valores é evidência clara de abusividade na fixação das taxas de juros cobradas pela requerida, o que viola o princípio da boa-fé objetiva, previsto no artigo 422 do Código Civil. Conforme leciona Pablo </w:t>
+      </w:r>
+      <w:proofErr w:type="spellStart"/>
+      <w:r>
+        <w:t>Stolze</w:t>
+      </w:r>
+      <w:proofErr w:type="spellEnd"/>
+      <w:r>
+        <w:t xml:space="preserve"> </w:t>
+      </w:r>
+      <w:proofErr w:type="spellStart"/>
+      <w:r>
+        <w:t>Gagliano</w:t>
+      </w:r>
+      <w:proofErr w:type="spellEnd"/>
+      <w:r>
+        <w:t xml:space="preserve"> e Rodolfo Pamplona Filho (Novo Curso de Direito Civil, Volume II), “a boa-fé objetiva exige que as partes não só tenham um comportamento ético, mas também que não exerçam seus direitos de forma excessivamente gravosa ao outro contratante”.</w:t>
+      </w:r>
+    </w:p>
+    <w:p/>
+    <w:p>
+      <w:r>
+        <w:t>Diante do exposto, é imprescindível a revisão judicial dos contratos firmados entre as partes, de modo a adequar as taxas de juros cobradas à média de mercado praticada na data das contratações. Tal adequação visa restabelecer o equilíbrio contratual e assegurar que o consumidor não seja onerado de forma injusta e desproporcional.</w:t>
+      </w:r>
+    </w:p>
+    <w:p/>
+    <w:p>
+      <w:r>
+        <w:t xml:space="preserve">Assim, requer-se a este juízo que, reconhecendo a abusividade das taxas de juros aplicadas, determine a sua </w:t>
       </w:r>
       <w:r>
         <w:lastRenderedPageBreak/>
-        <w:t>a taxa de juros mensal informada pela instituição req</w:t>
-      </w:r>
-      <w:r>
-        <w:t xml:space="preserve">uerida </w:t>
-      </w:r>
-      <w:r>
-        <w:t xml:space="preserve">fora de </w:t>
-      </w:r>
-      <w:r>
-        <w:t xml:space="preserve">{{emprestimos_0_taxa}}% </w:t>
-      </w:r>
-      <w:r>
-        <w:t>ao mês!</w:t>
-      </w:r>
-    </w:p>
-    <w:p>
-      <w:pPr>
-        <w:ind w:firstLine="2268"/>
-        <w:rPr>
-          <w:u w:val="single"/>
-        </w:rPr>
-      </w:pPr>
-      <w:r>
-        <w:rPr>
-          <w:noProof/>
-        </w:rPr>
-        <mc:AlternateContent>
-          <mc:Choice Requires="wps">
-            <w:drawing>
-              <wp:anchor distT="0" distB="0" distL="114300" distR="114300" simplePos="0" relativeHeight="251658240" behindDoc="1" locked="0" layoutInCell="1" hidden="0" allowOverlap="1" wp14:anchorId="7C2B004A" wp14:editId="07F1CECE">
-                <wp:simplePos x="0" y="0"/>
-                <wp:positionH relativeFrom="column">
-                  <wp:posOffset>1559698</wp:posOffset>
-                </wp:positionH>
-                <wp:positionV relativeFrom="paragraph">
-                  <wp:posOffset>278931</wp:posOffset>
-                </wp:positionV>
-                <wp:extent cx="3879850" cy="1403350"/>
-                <wp:effectExtent l="0" t="0" r="25400" b="25400"/>
-                <wp:wrapNone/>
-                <wp:docPr id="1933442842" name="Retângulo 1933442842"/>
-                <wp:cNvGraphicFramePr/>
-                <a:graphic xmlns:a="http://schemas.openxmlformats.org/drawingml/2006/main">
-                  <a:graphicData uri="http://schemas.microsoft.com/office/word/2010/wordprocessingShape">
-                    <wps:wsp>
-                      <wps:cNvSpPr/>
-                      <wps:spPr>
-                        <a:xfrm>
-                          <a:off x="0" y="0"/>
-                          <a:ext cx="3879850" cy="1403350"/>
-                        </a:xfrm>
-                        <a:prstGeom prst="rect">
-                          <a:avLst/>
-                        </a:prstGeom>
-                        <a:noFill/>
-                        <a:ln w="12700" cap="flat" cmpd="sng">
-                          <a:solidFill>
-                            <a:srgbClr val="1C3052"/>
-                          </a:solidFill>
-                          <a:prstDash val="solid"/>
-                          <a:miter lim="800000"/>
-                          <a:headEnd type="none" w="sm" len="sm"/>
-                          <a:tailEnd type="none" w="sm" len="sm"/>
-                        </a:ln>
-                      </wps:spPr>
-                      <wps:txbx>
-                        <w:txbxContent>
-                          <w:p>
-                            <w:pPr>
-                              <w:spacing w:after="0" w:line="240" w:lineRule="auto"/>
-                              <w:ind w:firstLine="0"/>
-                              <w:jc w:val="left"/>
-                              <w:textDirection w:val="btLr"/>
-                            </w:pPr>
-                          </w:p>
-                        </w:txbxContent>
-                      </wps:txbx>
-                      <wps:bodyPr spcFirstLastPara="1" wrap="square" lIns="91425" tIns="91425" rIns="91425" bIns="91425" anchor="ctr" anchorCtr="0">
-                        <a:noAutofit/>
-                      </wps:bodyPr>
-                    </wps:wsp>
-                  </a:graphicData>
-                </a:graphic>
-              </wp:anchor>
-            </w:drawing>
-          </mc:Choice>
-          <mc:Fallback>
-            <w:pict>
-              <v:rect w14:anchorId="7C2B004A" id="Retângulo 1933442842" o:spid="_x0000_s1026" style="position:absolute;left:0;text-align:left;margin-left:122.8pt;margin-top:21.95pt;width:305.5pt;height:110.5pt;z-index:-251658240;visibility:visible;mso-wrap-style:square;mso-wrap-distance-left:9pt;mso-wrap-distance-top:0;mso-wrap-distance-right:9pt;mso-wrap-distance-bottom:0;mso-position-horizontal:absolute;mso-position-horizontal-relative:text;mso-position-vertical:absolute;mso-position-vertical-relative:text;v-text-anchor:middle" o:gfxdata="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" filled="f" strokecolor="#1c3052" strokeweight="1pt">
-                <v:stroke startarrowwidth="narrow" startarrowlength="short" endarrowwidth="narrow" endarrowlength="short"/>
-                <v:textbox inset="2.53958mm,2.53958mm,2.53958mm,2.53958mm">
-                  <w:txbxContent>
-                    <w:p>
-                      <w:pPr>
-                        <w:spacing w:after="0" w:line="240" w:lineRule="auto"/>
-                        <w:ind w:firstLine="0"/>
-                        <w:jc w:val="left"/>
-                        <w:textDirection w:val="btLr"/>
-                      </w:pPr>
-                    </w:p>
-                  </w:txbxContent>
-                </v:textbox>
-              </v:rect>
-            </w:pict>
-          </mc:Fallback>
-        </mc:AlternateContent>
-      </w:r>
-      <w:r>
-        <w:rPr>
-          <w:noProof/>
-        </w:rPr>
-        <mc:AlternateContent>
-          <mc:Choice Requires="wpg">
-            <w:drawing>
-              <wp:anchor distT="0" distB="0" distL="114300" distR="114300" simplePos="0" relativeHeight="251659264" behindDoc="0" locked="0" layoutInCell="1" hidden="0" allowOverlap="1" wp14:anchorId="42903DA7" wp14:editId="329A132D">
-                <wp:simplePos x="0" y="0"/>
-                <wp:positionH relativeFrom="column">
-                  <wp:posOffset>215900</wp:posOffset>
-                </wp:positionH>
-                <wp:positionV relativeFrom="paragraph">
-                  <wp:posOffset>0</wp:posOffset>
-                </wp:positionV>
-                <wp:extent cx="1104900" cy="895350"/>
-                <wp:effectExtent l="0" t="0" r="0" b="0"/>
-                <wp:wrapNone/>
-                <wp:docPr id="1933442841" name="Conector de Seta Reta 1933442841"/>
-                <wp:cNvGraphicFramePr/>
-                <a:graphic xmlns:a="http://schemas.openxmlformats.org/drawingml/2006/main">
-                  <a:graphicData uri="http://schemas.microsoft.com/office/word/2010/wordprocessingShape">
-                    <wps:wsp>
-                      <wps:cNvCnPr/>
-                      <wps:spPr>
-                        <a:xfrm>
-                          <a:off x="4798313" y="3337088"/>
-                          <a:ext cx="1095375" cy="885825"/>
-                        </a:xfrm>
-                        <a:prstGeom prst="straightConnector1">
-                          <a:avLst/>
-                        </a:prstGeom>
-                        <a:noFill/>
-                        <a:ln w="9525" cap="flat" cmpd="sng">
-                          <a:solidFill>
-                            <a:schemeClr val="accent1"/>
-                          </a:solidFill>
-                          <a:prstDash val="solid"/>
-                          <a:miter lim="800000"/>
-                          <a:headEnd type="none" w="sm" len="sm"/>
-                          <a:tailEnd type="triangle" w="med" len="med"/>
-                        </a:ln>
-                      </wps:spPr>
-                      <wps:bodyPr/>
-                    </wps:wsp>
-                  </a:graphicData>
-                </a:graphic>
-              </wp:anchor>
-            </w:drawing>
-          </mc:Choice>
-          <mc:Fallback xmlns:cr="http://schemas.microsoft.com/office/comments/2020/reactions" xmlns="http://schemas.microsoft.com/office/tasks/2019/documenttasks" xmlns:dgm="http://schemas.openxmlformats.org/drawingml/2006/diagram" xmlns:lc="http://schemas.openxmlformats.org/drawingml/2006/lockedCanvas" xmlns:c="http://schemas.openxmlformats.org/drawingml/2006/chart" xmlns:pic="http://schemas.openxmlformats.org/drawingml/2006/picture" xmlns:a="http://schemas.openxmlformats.org/drawingml/2006/main" xmlns:sl="http://schemas.openxmlformats.org/schemaLibrary/2006/main">
-            <w:drawing>
-              <wp:anchor allowOverlap="1" behindDoc="0" distB="0" distT="0" distL="114300" distR="114300" hidden="0" layoutInCell="1" locked="0" relativeHeight="0" simplePos="0">
-                <wp:simplePos x="0" y="0"/>
-                <wp:positionH relativeFrom="column">
-                  <wp:posOffset>215900</wp:posOffset>
-                </wp:positionH>
-                <wp:positionV relativeFrom="paragraph">
-                  <wp:posOffset>0</wp:posOffset>
-                </wp:positionV>
-                <wp:extent cx="1104900" cy="895350"/>
-                <wp:effectExtent b="0" l="0" r="0" t="0"/>
-                <wp:wrapNone/>
-                <wp:docPr id="1933442841" name="image6.png"/>
-                <a:graphic>
-                  <a:graphicData uri="http://schemas.openxmlformats.org/drawingml/2006/picture">
-                    <pic:pic>
-                      <pic:nvPicPr>
-                        <pic:cNvPr id="0" name="image6.png"/>
-                        <pic:cNvPicPr preferRelativeResize="0"/>
-                      </pic:nvPicPr>
-                      <pic:blipFill>
-                        <a:blip r:embed="rId14"/>
-                        <a:srcRect/>
-                        <a:stretch>
-                          <a:fillRect/>
-                        </a:stretch>
-                      </pic:blipFill>
-                      <pic:spPr>
-                        <a:xfrm>
-                          <a:off x="0" y="0"/>
-                          <a:ext cx="1104900" cy="895350"/>
-                        </a:xfrm>
-                        <a:prstGeom prst="rect"/>
-                        <a:ln/>
-                      </pic:spPr>
-                    </pic:pic>
-                  </a:graphicData>
-                </a:graphic>
-              </wp:anchor>
-            </w:drawing>
-          </mc:Fallback>
-        </mc:AlternateContent>
-      </w:r>
-    </w:p>
-    <w:p>
-      <w:pPr>
-        <w:ind w:left="2552" w:firstLine="0"/>
-        <w:rPr>
-          <w:u w:val="single"/>
-        </w:rPr>
-      </w:pPr>
-      <w:r>
-        <w:rPr>
-          <w:b/>
-          <w:highlight w:val="yellow"/>
-          <w:u w:val="single"/>
-        </w:rPr>
-        <w:t>Isso equivale a dizer que a taxa de juros aplicada ao</w:t>
-      </w:r>
-      <w:r>
-        <w:rPr>
-          <w:b/>
-          <w:highlight w:val="yellow"/>
-          <w:u w:val="single"/>
-        </w:rPr>
-        <w:t xml:space="preserve"> contrato entabulado</w:t>
-      </w:r>
-      <w:r>
-        <w:rPr>
-          <w:b/>
-          <w:highlight w:val="yellow"/>
-          <w:u w:val="single"/>
-        </w:rPr>
-        <w:t xml:space="preserve"> entre as partes é quase quatro vezes superior à taxa média mensal para as operações de mesma natureza no período.</w:t>
-      </w:r>
-    </w:p>
-    <w:p>
-      <w:pPr>
-        <w:ind w:firstLine="2268"/>
-        <w:rPr>
-          <w:u w:val="single"/>
-        </w:rPr>
-      </w:pPr>
-    </w:p>
-    <w:p>
-      <w:pPr>
-        <w:ind w:firstLine="2268"/>
-        <w:rPr>
-          <w:u w:val="single"/>
-        </w:rPr>
-      </w:pPr>
-      <w:r>
-        <w:t xml:space="preserve">Tal discrepância de valores é evidência clara de abusividade na fixação das taxas de juros cobradas pela requerida, o que viola o princípio da boa-fé objetiva, previsto no artigo 422 do Código Civil. Conforme leciona Pablo </w:t>
-      </w:r>
-      <w:proofErr w:type="spellStart"/>
-      <w:r>
-        <w:t>Stolze</w:t>
-      </w:r>
-      <w:proofErr w:type="spellEnd"/>
-      <w:r>
-        <w:t xml:space="preserve"> </w:t>
-      </w:r>
-      <w:proofErr w:type="spellStart"/>
-      <w:r>
-        <w:t>Gagliano</w:t>
-      </w:r>
-      <w:proofErr w:type="spellEnd"/>
-      <w:r>
-        <w:t xml:space="preserve"> e Rodolfo Pamplona Filho (Novo Curso de Direito Civil, Volume II), “a boa-fé objetiva exige que as partes não só tenham um comportamento ético, mas também que não exerçam seus direitos de forma excessivamente gravosa ao outro contratante”.</w:t>
-      </w:r>
-    </w:p>
-    <w:p/>
-    <w:p>
-      <w:r>
-        <w:t>Diante do exposto, é imprescindível a revisão judicial dos contratos firmados entre as partes, de modo a adequar as taxas de juros cobradas à média de mercado praticada na data das contratações. Tal adequação visa restabelecer o equilíbrio contratual e assegurar que o consumidor não seja onerado de forma injusta e desproporcional.</w:t>
-      </w:r>
-    </w:p>
-    <w:p/>
-    <w:p>
-      <w:r>
-        <w:lastRenderedPageBreak/>
-        <w:t>Assim, requer-se a este juízo que, reconhecendo a abusividade das taxas de juros aplicadas, determine a sua adequação à taxa média de mercado divulgada pelo Banco Central na data da contratação.</w:t>
+        <w:t>adequação à taxa média de mercado divulgada pelo Banco Central na data da contratação.</w:t>
       </w:r>
     </w:p>
     <w:p>
@@ -1638,8 +1482,11 @@
     <w:p/>
     <w:p>
       <w:r>
+        <w:t xml:space="preserve">O cálculo do indébito deve considerar o valor efetivamente pago pelo requerente e o valor que seria devido caso fosse aplicada </w:t>
+      </w:r>
+      <w:r>
         <w:lastRenderedPageBreak/>
-        <w:t xml:space="preserve">O cálculo do indébito deve considerar o valor efetivamente pago pelo requerente e o valor que seria devido caso fosse aplicada a taxa média de mercado. A partir desses valores, é possível determinar o montante pago em excesso. </w:t>
+        <w:t xml:space="preserve">a taxa média de mercado. A partir desses valores, é possível determinar o montante pago em excesso. </w:t>
       </w:r>
     </w:p>
     <w:p/>
@@ -1694,8 +1541,9 @@
           <w:sz w:val="22"/>
           <w:szCs w:val="22"/>
         </w:rPr>
-        <w:t xml:space="preserve">. 2. Na configuração da divergência do presente caso, temos, de um lado, o acórdão embargado da Terceira Turma concluindo que a norma do art. 42 do Código de Defesa do Consumidor pressupõe a demonstração de que a cobrança indevida </w:t>
-      </w:r>
+        <w:t xml:space="preserve">. 2. Na configuração da divergência do presente caso, temos, de um lado, o acórdão embargado da Terceira Turma concluindo que a norma do art. 42 do Código de Defesa do Consumidor pressupõe a demonstração de que a cobrança indevida decorreu de má-fé do credor fornecedor do serviço, enquanto os acórdãos-paradigmas da Primeira Seção afirmam que a repetição em dobro prescinde de má-fé, bastando a culpa. Ilustrando o posicionamento da Primeira Seção: </w:t>
+      </w:r>
+      <w:proofErr w:type="spellStart"/>
       <w:r>
         <w:rPr>
           <w:i/>
@@ -1703,10 +1551,9 @@
           <w:sz w:val="22"/>
           <w:szCs w:val="22"/>
         </w:rPr>
-        <w:lastRenderedPageBreak/>
-        <w:t xml:space="preserve">decorreu de má-fé do credor fornecedor do serviço, enquanto os acórdãos-paradigmas da Primeira Seção afirmam que a repetição em dobro prescinde de má-fé, bastando a culpa. Ilustrando o posicionamento da Primeira Seção: </w:t>
-      </w:r>
-      <w:proofErr w:type="spellStart"/>
+        <w:t>EREsp</w:t>
+      </w:r>
+      <w:proofErr w:type="spellEnd"/>
       <w:r>
         <w:rPr>
           <w:i/>
@@ -1714,9 +1561,8 @@
           <w:sz w:val="22"/>
           <w:szCs w:val="22"/>
         </w:rPr>
-        <w:t>EREsp</w:t>
-      </w:r>
-      <w:proofErr w:type="spellEnd"/>
+        <w:t xml:space="preserve"> 1.155.827/SP, Rel. Min. </w:t>
+      </w:r>
       <w:r>
         <w:rPr>
           <w:i/>
@@ -1724,7 +1570,8 @@
           <w:sz w:val="22"/>
           <w:szCs w:val="22"/>
         </w:rPr>
-        <w:t xml:space="preserve"> 1.155.827/SP, Rel. Min. Humberto Martins, Primeira Seção, </w:t>
+        <w:lastRenderedPageBreak/>
+        <w:t xml:space="preserve">Humberto Martins, Primeira Seção, </w:t>
       </w:r>
       <w:proofErr w:type="spellStart"/>
       <w:r>
@@ -1848,7 +1695,27 @@
           <w:color w:val="000000"/>
           <w:highlight w:val="yellow"/>
         </w:rPr>
-        <w:t xml:space="preserve">A tese da exclusividade do dolo inviabiliza, por exemplo, a devolução em dobro de pacotes de serviços, no caso de telefonia, jamais solicitados pelo consumidor e sobre o qual o fornecedor do serviço invoque qualquer "justificativa do seu engano". Isso porque o requisito subjetivo da má-fé é prova substancialmente difícil de produzir. Exigir que o consumidor prove dolo ou má-fé do fornecedor é imputar-lhe prova diabólica, padrão probatório que vai de encontro às próprias filosofia e </w:t>
+        <w:t xml:space="preserve">A tese da exclusividade do dolo inviabiliza, por exemplo, a devolução em dobro de pacotes de serviços, no caso de telefonia, jamais solicitados pelo consumidor e sobre o qual o fornecedor do serviço invoque qualquer "justificativa do seu engano". Isso porque o requisito subjetivo da má-fé é prova substancialmente difícil de produzir. Exigir que o consumidor prove dolo ou má-fé do fornecedor é imputar-lhe prova diabólica, padrão probatório que vai de encontro às </w:t>
+      </w:r>
+      <w:proofErr w:type="gramStart"/>
+      <w:r>
+        <w:rPr>
+          <w:b/>
+          <w:i/>
+          <w:color w:val="000000"/>
+          <w:highlight w:val="yellow"/>
+        </w:rPr>
+        <w:t>próprias filosofia</w:t>
+      </w:r>
+      <w:proofErr w:type="gramEnd"/>
+      <w:r>
+        <w:rPr>
+          <w:b/>
+          <w:i/>
+          <w:color w:val="000000"/>
+          <w:highlight w:val="yellow"/>
+        </w:rPr>
+        <w:t xml:space="preserve"> e </w:t>
       </w:r>
       <w:proofErr w:type="spellStart"/>
       <w:r>
@@ -1868,7 +1735,7 @@
           <w:color w:val="000000"/>
           <w:highlight w:val="yellow"/>
         </w:rPr>
-        <w:t xml:space="preserve"> do CDC. 7. Não vislumbro distinção para os </w:t>
+        <w:t xml:space="preserve"> do CDC. 7. Não vislumbro distinção para os casos em que o indébito provém de contratos que não envolvam fornecimento de serviços públicos, de forma que também deve prevalecer para todas as hipóteses a tese, </w:t>
       </w:r>
       <w:r>
         <w:rPr>
@@ -1878,7 +1745,7 @@
           <w:highlight w:val="yellow"/>
         </w:rPr>
         <w:lastRenderedPageBreak/>
-        <w:t>casos em que o indébito provém de contratos que não envolvam fornecimento de serviços públicos, de forma que também deve prevalecer para todas as hipóteses a tese, que defendi acima, de que tanto a conduta dolosa quanto culposa do fornecedor de serviços dá azo à devolução em dobro do indébito, de acordo com o art. 42 do CDC</w:t>
+        <w:t>que defendi acima, de que tanto a conduta dolosa quanto culposa do fornecedor de serviços dá azo à devolução em dobro do indébito, de acordo com o art. 42 do CDC</w:t>
       </w:r>
       <w:r>
         <w:rPr>
@@ -1927,7 +1794,7 @@
           <w:sz w:val="22"/>
           <w:szCs w:val="22"/>
         </w:rPr>
-        <w:t xml:space="preserve">, na forma estabelecida no art. 177 do Código Civil de 1916, ou decenal, de acordo com o previsto no art. 205 do Código Civil de 2002. Diante da mesma conjuntura, não há razões para adotar solução diversa nos casos de repetição de indébito dos serviços de telefonia. 9. A tese adotada no âmbito do acórdão recorrido, de que a pretensão de repetição de indébito por cobrança indevida de valores referentes a serviços não contratados, promovida por empresa de telefonia, configuraria enriquecimento sem causa e, portanto, estaria abrangida pelo prazo fixado no art. 206, § 3º, IV, do Código Civil, não parece ser a melhor. A pretensão de enriquecimento sem causa (ação in rem verso) possui como requisitos: enriquecimento de alguém; empobrecimento correspondente de outrem; relação de causalidade entre ambos; ausência de causa jurídica; inexistência de ação específica. Trata-se, portanto, de ação subsidiária que depende da inexistência de causa jurídica. A discussão acerca da cobrança indevida de valores constantes de relação contratual e eventual repetição de indébito não se enquadra na hipótese do art. 206, § 3º, IV, do Código Civil, seja porque a causa jurídica, em princípio, existe (relação contratual prévia em que se debate a legitimidade da cobrança), seja porque a ação de repetição de indébito é ação específica. Doutrina. 10. Na hipótese aqui tratada, a jurisprudência da Segunda Seção, relativa a contratos privados, seguia compreensão que, com o presente julgamento, passa a ser superada, em consonância com a dominante da Primeira Seção, o que faz sobressair a necessidade de privilegiar os </w:t>
+        <w:t xml:space="preserve">, na forma estabelecida no art. 177 do Código Civil de 1916, ou decenal, de acordo com o previsto no art. 205 do Código Civil de 2002. Diante da mesma conjuntura, não há razões para adotar solução diversa nos casos de repetição de indébito dos serviços de telefonia. 9. A tese adotada no âmbito do acórdão recorrido, de que a pretensão de repetição de indébito por cobrança indevida de valores referentes a serviços não contratados, promovida por empresa de telefonia, configuraria enriquecimento sem causa e, portanto, estaria abrangida pelo prazo fixado no art. 206, § 3º, IV, do Código Civil, não parece ser a melhor. A pretensão de enriquecimento sem causa (ação in rem verso) possui como requisitos: enriquecimento de alguém; empobrecimento correspondente de outrem; relação de causalidade entre ambos; ausência de causa jurídica; inexistência de ação específica. Trata-se, portanto, de ação subsidiária que depende da inexistência de causa jurídica. A discussão acerca da cobrança indevida de valores constantes de relação contratual e eventual repetição de indébito não se enquadra na hipótese do art. 206, § 3º, IV, do Código Civil, seja porque a causa jurídica, em princípio, existe (relação contratual prévia em que se debate a legitimidade da cobrança), seja porque a ação de repetição de indébito é ação específica. Doutrina. 10. Na hipótese aqui tratada, a jurisprudência da Segunda Seção, relativa a contratos privados, seguia compreensão que, com o presente julgamento, passa a ser superada, em consonância com a dominante da Primeira Seção, o que faz sobressair a necessidade de privilegiar os princípios da segurança jurídica e da proteção da confiança dos jurisdicionados. 11. Assim, proponho modular os efeitos da presente decisão para que o entendimento aqui fixado seja empregado aos indébitos de natureza contratual não pública pagos após a data da </w:t>
       </w:r>
       <w:r>
         <w:rPr>
@@ -1937,7 +1804,7 @@
           <w:szCs w:val="22"/>
         </w:rPr>
         <w:lastRenderedPageBreak/>
-        <w:t xml:space="preserve">princípios da segurança jurídica e da proteção da confiança dos jurisdicionados. 11. Assim, proponho modular os efeitos da presente decisão para que o entendimento aqui fixado seja empregado aos indébitos de natureza contratual não pública pagos após a data da publicação do acórdão. 12. </w:t>
+        <w:t xml:space="preserve">publicação do acórdão. 12. </w:t>
       </w:r>
       <w:r>
         <w:rPr>
@@ -2072,8 +1939,14 @@
         <w:rPr>
           <w:highlight w:val="yellow"/>
         </w:rPr>
+        <w:t xml:space="preserve">Portanto, pleiteia, a parte autora, a devolução dos valores equivalentes a diferença dos valores que seriam pagos pela parte </w:t>
+      </w:r>
+      <w:r>
+        <w:rPr>
+          <w:highlight w:val="yellow"/>
+        </w:rPr>
         <w:lastRenderedPageBreak/>
-        <w:t xml:space="preserve">Portanto, pleiteia, a parte autora, a devolução dos valores equivalentes a diferença dos valores que seriam pagos pela parte requerente, subtraídos pelo valor correspondente ao total que pagaria com a adequação das taxas de juros à média de mercado, multiplicado por dois, sendo devidos assim a restituição de </w:t>
+        <w:t xml:space="preserve">requerente, subtraídos pelo valor correspondente ao total que pagaria com a adequação das taxas de juros à média de mercado, multiplicado por dois, sendo devidos assim a restituição de </w:t>
       </w:r>
       <w:r>
         <w:t>{{emprestimos_</w:t>
@@ -2161,8 +2034,11 @@
     <w:p/>
     <w:p>
       <w:r>
+        <w:t xml:space="preserve">No presente caso, as cobranças abusivas de juros exorbitantes configuram uma afronta à dignidade da pessoa humana e </w:t>
+      </w:r>
+      <w:r>
         <w:lastRenderedPageBreak/>
-        <w:t>No presente caso, as cobranças abusivas de juros exorbitantes configuram uma afronta à dignidade da pessoa humana e inclusive ao direito à vida, uma vez que responsável por colocar a parte autora em condição de miserabilidade extrema!</w:t>
+        <w:t>inclusive ao direito à vida, uma vez que responsável por colocar a parte autora em condição de miserabilidade extrema!</w:t>
       </w:r>
     </w:p>
     <w:p/>
@@ -2203,6 +2079,7 @@
         </w:rPr>
         <w:t>comprometimento_porcentagem</w:t>
       </w:r>
+      <w:proofErr w:type="gramStart"/>
       <w:r>
         <w:rPr>
           <w:sz w:val="28"/>
@@ -2219,6 +2096,7 @@
         </w:rPr>
         <w:t>%</w:t>
       </w:r>
+      <w:proofErr w:type="gramEnd"/>
       <w:r>
         <w:rPr>
           <w:b/>
@@ -2244,23 +2122,11 @@
         </w:rPr>
         <w:t>{{</w:t>
       </w:r>
-      <w:r>
-        <w:t>emprestimos_0_</w:t>
-      </w:r>
-      <w:r>
-        <w:rPr>
-          <w:sz w:val="28"/>
-          <w:szCs w:val="28"/>
-        </w:rPr>
-        <w:t>renda_</w:t>
-      </w:r>
-      <w:r>
-        <w:rPr>
-          <w:sz w:val="28"/>
-          <w:szCs w:val="28"/>
-        </w:rPr>
-        <w:t>atual</w:t>
-      </w:r>
+      <w:proofErr w:type="spellStart"/>
+      <w:r>
+        <w:t>renda_mensal</w:t>
+      </w:r>
+      <w:proofErr w:type="spellEnd"/>
       <w:r>
         <w:rPr>
           <w:sz w:val="28"/>
@@ -2305,7 +2171,6 @@
     </w:p>
     <w:p>
       <w:pPr>
-        <w:ind w:firstLine="0"/>
         <w:rPr>
           <w:sz w:val="28"/>
           <w:szCs w:val="28"/>
@@ -2337,9 +2202,9 @@
           <w:szCs w:val="28"/>
           <w:highlight w:val="yellow"/>
         </w:rPr>
-        <w:t>valor_liquido</w:t>
-      </w:r>
-      <w:proofErr w:type="spellEnd"/>
+        <w:t>valor_</w:t>
+      </w:r>
+      <w:proofErr w:type="gramStart"/>
       <w:r>
         <w:rPr>
           <w:b/>
@@ -2347,8 +2212,10 @@
           <w:szCs w:val="28"/>
           <w:highlight w:val="yellow"/>
         </w:rPr>
-        <w:t>}}</w:t>
-      </w:r>
+        <w:t>liquido</w:t>
+      </w:r>
+      <w:proofErr w:type="spellEnd"/>
+      <w:proofErr w:type="gramEnd"/>
       <w:r>
         <w:rPr>
           <w:b/>
@@ -2356,30 +2223,6 @@
           <w:szCs w:val="28"/>
           <w:highlight w:val="yellow"/>
         </w:rPr>
-        <w:t xml:space="preserve"> por mês, cerca de </w:t>
-      </w:r>
-      <w:r>
-        <w:rPr>
-          <w:sz w:val="28"/>
-          <w:szCs w:val="28"/>
-        </w:rPr>
-        <w:t>{{</w:t>
-      </w:r>
-      <w:r>
-        <w:t>emprestimos_0_</w:t>
-      </w:r>
-      <w:r>
-        <w:rPr>
-          <w:sz w:val="28"/>
-          <w:szCs w:val="28"/>
-        </w:rPr>
-        <w:t>diario</w:t>
-      </w:r>
-      <w:r>
-        <w:rPr>
-          <w:sz w:val="28"/>
-          <w:szCs w:val="28"/>
-        </w:rPr>
         <w:t>}}</w:t>
       </w:r>
       <w:r>
@@ -2389,7 +2232,38 @@
           <w:szCs w:val="28"/>
           <w:highlight w:val="yellow"/>
         </w:rPr>
-        <w:t>por</w:t>
+        <w:t xml:space="preserve"> por mês, cerca de </w:t>
+      </w:r>
+      <w:r>
+        <w:rPr>
+          <w:sz w:val="28"/>
+          <w:szCs w:val="28"/>
+        </w:rPr>
+        <w:t>{{</w:t>
+      </w:r>
+      <w:r>
+        <w:t>emprestimos_0_</w:t>
+      </w:r>
+      <w:r>
+        <w:rPr>
+          <w:sz w:val="28"/>
+          <w:szCs w:val="28"/>
+        </w:rPr>
+        <w:t>diario</w:t>
+      </w:r>
+      <w:r>
+        <w:rPr>
+          <w:sz w:val="28"/>
+          <w:szCs w:val="28"/>
+        </w:rPr>
+        <w:t>}}</w:t>
+      </w:r>
+      <w:r>
+        <w:rPr>
+          <w:sz w:val="28"/>
+          <w:szCs w:val="28"/>
+        </w:rPr>
+        <w:t xml:space="preserve"> </w:t>
       </w:r>
       <w:r>
         <w:rPr>
@@ -2398,6 +2272,15 @@
           <w:szCs w:val="28"/>
           <w:highlight w:val="yellow"/>
         </w:rPr>
+        <w:t>por</w:t>
+      </w:r>
+      <w:r>
+        <w:rPr>
+          <w:b/>
+          <w:sz w:val="28"/>
+          <w:szCs w:val="28"/>
+          <w:highlight w:val="yellow"/>
+        </w:rPr>
         <w:t xml:space="preserve"> dia!! É um escracho!!</w:t>
       </w:r>
     </w:p>
@@ -2410,8 +2293,11 @@
     <w:p/>
     <w:p>
       <w:r>
+        <w:t xml:space="preserve">Diante do exposto, é imprescindível que este juízo reconheça o dano moral sofrido pela parte requerente e condene a </w:t>
+      </w:r>
+      <w:r>
         <w:lastRenderedPageBreak/>
-        <w:t xml:space="preserve">Diante do exposto, é imprescindível que este juízo reconheça o dano moral sofrido pela parte requerente e condene a instituição financeira requerida ao pagamento de indenização a título de danos morais. </w:t>
+        <w:t xml:space="preserve">instituição financeira requerida ao pagamento de indenização a título de danos morais. </w:t>
       </w:r>
     </w:p>
     <w:p/>
@@ -2448,8 +2334,19 @@
     <w:p/>
     <w:p>
       <w:r>
+        <w:t xml:space="preserve">O Código de Defesa do Consumidor (CDC) prevê, em seu artigo 6º, inciso VIII, a possibilidade de inversão do ônus da prova </w:t>
+      </w:r>
+      <w:r>
         <w:lastRenderedPageBreak/>
-        <w:t>O Código de Defesa do Consumidor (CDC) prevê, em seu artigo 6º, inciso VIII, a possibilidade de inversão do ônus da prova em favor do consumidor, quando, a critério do juiz, for verossímil a alegação ou quando o consumidor for hipossuficiente, segundo as regras ordinárias de experiências. Tal previsão visa equilibrar a relação entre consumidor e fornecedor, especialmente em situações onde o consumidor se encontra em desvantagem técnica, econômica ou jurídica.</w:t>
+        <w:t xml:space="preserve">em favor do consumidor, quando, a critério do juiz, for verossímil a alegação ou quando o consumidor for hipossuficiente, segundo as regras ordinárias de experiências. Tal previsão visa equilibrar a relação entre consumidor e fornecedor, especialmente em situações </w:t>
+      </w:r>
+      <w:proofErr w:type="gramStart"/>
+      <w:r>
+        <w:t>onde</w:t>
+      </w:r>
+      <w:proofErr w:type="gramEnd"/>
+      <w:r>
+        <w:t xml:space="preserve"> o consumidor se encontra em desvantagem técnica, econômica ou jurídica.</w:t>
       </w:r>
     </w:p>
     <w:p>
@@ -2474,13 +2371,13 @@
     <w:p/>
     <w:p>
       <w:r>
+        <w:t xml:space="preserve">Tal medida é essencial para assegurar a efetiva proteção dos direitos do consumidor e promover a justiça na relação contratual, garantindo que a verdade dos fatos seja plenamente apurada e que o </w:t>
+      </w:r>
+      <w:r>
         <w:lastRenderedPageBreak/>
-        <w:t>Tal medida é essencial para assegurar a efetiva proteção dos direitos do consumidor e promover a justiça na relação contratual, garantindo que a verdade dos fatos seja plenamente apurada e que o requerente não seja prejudicado pela desvantagem técnica e econômica em relação à instituição financeira requerida.</w:t>
-      </w:r>
-    </w:p>
-    <w:p/>
-    <w:p/>
-    <w:p/>
+        <w:t>requerente não seja prejudicado pela desvantagem técnica e econômica em relação à instituição financeira requerida.</w:t>
+      </w:r>
+    </w:p>
     <w:p/>
     <w:p>
       <w:pPr>
@@ -2787,7 +2684,15 @@
         <w:jc w:val="center"/>
       </w:pPr>
       <w:r>
-        <w:t>Batatais/SP, 18 de Novembro de 2024</w:t>
+        <w:t xml:space="preserve">Batatais/SP, 18 de </w:t>
+      </w:r>
+      <w:proofErr w:type="gramStart"/>
+      <w:r>
+        <w:t>Novembro</w:t>
+      </w:r>
+      <w:proofErr w:type="gramEnd"/>
+      <w:r>
+        <w:t xml:space="preserve"> de 2024</w:t>
       </w:r>
     </w:p>
     <w:p>
@@ -2874,8 +2779,8 @@
       </w:r>
     </w:p>
     <w:sectPr>
-      <w:headerReference w:type="default" r:id="rId15"/>
-      <w:footerReference w:type="default" r:id="rId16"/>
+      <w:headerReference w:type="default" r:id="rId10"/>
+      <w:footerReference w:type="default" r:id="rId11"/>
       <w:pgSz w:w="11906" w:h="16838"/>
       <w:pgMar w:top="2268" w:right="1701" w:bottom="1701" w:left="1701" w:header="709" w:footer="709" w:gutter="0"/>
       <w:pgNumType w:start="1"/>

</xml_diff>